<commit_message>
chore: update BCDXCV + PASDV tiêu dùng templates
</commit_message>
<xml_diff>
--- a/report_assets/KHCN templates/Báo cáo đề xuất/2268.02A BCDXCV tieu dung co TSBD.docx
+++ b/report_assets/KHCN templates/Báo cáo đề xuất/2268.02A BCDXCV tieu dung co TSBD.docx
@@ -105,7 +105,7 @@
                 </mc:Choice>
                 <mc:Fallback>
                   <w:pict>
-                    <v:line w14:anchorId="12F31103" id="Straight Connector 1" o:spid="_x0000_s1026" style="position:absolute;z-index:251662336;visibility:visible;mso-wrap-style:square;mso-wrap-distance-left:9pt;mso-wrap-distance-top:0;mso-wrap-distance-right:9pt;mso-wrap-distance-bottom:0;mso-position-horizontal:center;mso-position-horizontal-relative:margin;mso-position-vertical:absolute;mso-position-vertical-relative:text" from="0,16.5pt" to="108pt,16.5pt" o:gfxdata="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">
+                    <v:line w14:anchorId="5D1E9223" id="Straight Connector 1" o:spid="_x0000_s1026" style="position:absolute;z-index:251662336;visibility:visible;mso-wrap-style:square;mso-wrap-distance-left:9pt;mso-wrap-distance-top:0;mso-wrap-distance-right:9pt;mso-wrap-distance-bottom:0;mso-position-horizontal:center;mso-position-horizontal-relative:margin;mso-position-vertical:absolute;mso-position-vertical-relative:text" from="0,16.5pt" to="108pt,16.5pt" o:gfxdata="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">
                       <w10:wrap anchorx="margin"/>
                     </v:line>
                   </w:pict>
@@ -257,7 +257,7 @@
                 </mc:Choice>
                 <mc:Fallback>
                   <w:pict>
-                    <v:shapetype w14:anchorId="3C63F719" id="_x0000_t32" coordsize="21600,21600" o:spt="32" o:oned="t" path="m,l21600,21600e" filled="f">
+                    <v:shapetype w14:anchorId="37A2A5CE" id="_x0000_t32" coordsize="21600,21600" o:spt="32" o:oned="t" path="m,l21600,21600e" filled="f">
                       <v:path arrowok="t" fillok="f" o:connecttype="none"/>
                       <o:lock v:ext="edit" shapetype="t"/>
                     </v:shapetype>
@@ -6094,276 +6094,6 @@
     </w:p>
     <w:p>
       <w:pPr>
-        <w:spacing w:before="120" w:after="120" w:line="276" w:lineRule="auto"/>
-        <w:jc w:val="both"/>
-        <w:rPr>
-          <w:rFonts w:ascii="Times New Roman" w:hAnsi="Times New Roman" w:cs="Times New Roman"/>
-          <w:sz w:val="26"/>
-          <w:szCs w:val="26"/>
-          <w:b/>
-          <w:bCs/>
-        </w:rPr>
-      </w:pPr>
-      <w:r>
-        <w:rPr>
-          <w:rFonts w:ascii="Times New Roman" w:hAnsi="Times New Roman" w:cs="Times New Roman"/>
-          <w:sz w:val="26"/>
-          <w:szCs w:val="26"/>
-          <w:b/>
-          <w:bCs/>
-        </w:rPr>
-        <w:t xml:space="preserve">4.1. Khả năng trả nợ của khách hàng:</w:t>
-      </w:r>
-    </w:p>
-    <w:p>
-      <w:pPr>
-        <w:spacing w:before="120" w:after="120" w:line="276" w:lineRule="auto"/>
-        <w:jc w:val="both"/>
-        <w:rPr>
-          <w:rFonts w:ascii="Times New Roman" w:hAnsi="Times New Roman" w:cs="Times New Roman"/>
-          <w:sz w:val="26"/>
-          <w:szCs w:val="26"/>
-        </w:rPr>
-      </w:pPr>
-      <w:r>
-        <w:rPr>
-          <w:rFonts w:ascii="Times New Roman" w:hAnsi="Times New Roman" w:cs="Times New Roman"/>
-          <w:sz w:val="26"/>
-          <w:szCs w:val="26"/>
-        </w:rPr>
-        <w:t xml:space="preserve">a) Thu nhập để trả nợ: Từ lương và phụ cấp của [PA.Mô tả người trả nợ]. [PA.Câu thu nhập];</w:t>
-      </w:r>
-    </w:p>
-    <w:p>
-      <w:pPr>
-        <w:spacing w:before="120" w:after="120" w:line="276" w:lineRule="auto"/>
-        <w:jc w:val="both"/>
-        <w:rPr>
-          <w:rFonts w:ascii="Times New Roman" w:hAnsi="Times New Roman" w:cs="Times New Roman"/>
-          <w:sz w:val="26"/>
-          <w:szCs w:val="26"/>
-        </w:rPr>
-      </w:pPr>
-      <w:r>
-        <w:rPr>
-          <w:rFonts w:ascii="Times New Roman" w:hAnsi="Times New Roman" w:cs="Times New Roman"/>
-          <w:sz w:val="26"/>
-          <w:szCs w:val="26"/>
-        </w:rPr>
-        <w:t xml:space="preserve">Tổng lương và phụ cấp bình quân trong [PA.Kỳ text]: [PA.Tổng thu nhập kỳ] đồng</w:t>
-      </w:r>
-    </w:p>
-    <w:p>
-      <w:pPr>
-        <w:spacing w:before="120" w:after="120" w:line="276" w:lineRule="auto"/>
-        <w:jc w:val="both"/>
-        <w:rPr>
-          <w:rFonts w:ascii="Times New Roman" w:hAnsi="Times New Roman" w:cs="Times New Roman"/>
-          <w:sz w:val="26"/>
-          <w:szCs w:val="26"/>
-        </w:rPr>
-      </w:pPr>
-      <w:r>
-        <w:rPr>
-          <w:rFonts w:ascii="Times New Roman" w:hAnsi="Times New Roman" w:cs="Times New Roman"/>
-          <w:sz w:val="26"/>
-          <w:szCs w:val="26"/>
-        </w:rPr>
-        <w:t xml:space="preserve">b) Tổng chi phí bình quân trong [PA.Kỳ text]: [PA.Tổng chi phí kỳ] đồng, trong đó:</w:t>
-      </w:r>
-    </w:p>
-    <w:p>
-      <w:pPr>
-        <w:spacing w:before="120" w:after="120" w:line="276" w:lineRule="auto"/>
-        <w:jc w:val="both"/>
-        <w:rPr>
-          <w:rFonts w:ascii="Times New Roman" w:hAnsi="Times New Roman" w:cs="Times New Roman"/>
-          <w:sz w:val="26"/>
-          <w:szCs w:val="26"/>
-        </w:rPr>
-      </w:pPr>
-      <w:r>
-        <w:rPr>
-          <w:rFonts w:ascii="Times New Roman" w:hAnsi="Times New Roman" w:cs="Times New Roman"/>
-          <w:sz w:val="26"/>
-          <w:szCs w:val="26"/>
-        </w:rPr>
-        <w:t xml:space="preserve">- Chi phí sinh hoạt bình quân trong [PA.Kỳ text]: [PA.Chi phí sinh hoạt kỳ] đồng;</w:t>
-      </w:r>
-    </w:p>
-    <w:p>
-      <w:pPr>
-        <w:spacing w:before="120" w:after="120" w:line="276" w:lineRule="auto"/>
-        <w:jc w:val="both"/>
-        <w:rPr>
-          <w:rFonts w:ascii="Times New Roman" w:hAnsi="Times New Roman" w:cs="Times New Roman"/>
-          <w:sz w:val="26"/>
-          <w:szCs w:val="26"/>
-        </w:rPr>
-      </w:pPr>
-      <w:r>
-        <w:rPr>
-          <w:rFonts w:ascii="Times New Roman" w:hAnsi="Times New Roman" w:cs="Times New Roman"/>
-          <w:sz w:val="26"/>
-          <w:szCs w:val="26"/>
-        </w:rPr>
-        <w:t xml:space="preserve">- Chi phí lãi vay (lãi suất bình quân là [PA.Lãi suất vay khác]/năm): [PA.Chi phí lãi vay kỳ] đồng;</w:t>
-      </w:r>
-    </w:p>
-    <w:p>
-      <w:pPr>
-        <w:spacing w:before="120" w:after="120" w:line="276" w:lineRule="auto"/>
-        <w:jc w:val="both"/>
-        <w:rPr>
-          <w:rFonts w:ascii="Times New Roman" w:hAnsi="Times New Roman" w:cs="Times New Roman"/>
-          <w:sz w:val="26"/>
-          <w:szCs w:val="26"/>
-        </w:rPr>
-      </w:pPr>
-      <w:r>
-        <w:rPr>
-          <w:rFonts w:ascii="Times New Roman" w:hAnsi="Times New Roman" w:cs="Times New Roman"/>
-          <w:sz w:val="26"/>
-          <w:szCs w:val="26"/>
-        </w:rPr>
-        <w:t xml:space="preserve">- Chi phí khác (các khoản vay khác;...): [PA.Chi phí khác kỳ] đồng.</w:t>
-      </w:r>
-    </w:p>
-    <w:p>
-      <w:pPr>
-        <w:spacing w:before="120" w:after="120" w:line="276" w:lineRule="auto"/>
-        <w:jc w:val="both"/>
-        <w:rPr>
-          <w:rFonts w:ascii="Times New Roman" w:hAnsi="Times New Roman" w:cs="Times New Roman"/>
-          <w:sz w:val="26"/>
-          <w:szCs w:val="26"/>
-        </w:rPr>
-      </w:pPr>
-      <w:r>
-        <w:rPr>
-          <w:rFonts w:ascii="Times New Roman" w:hAnsi="Times New Roman" w:cs="Times New Roman"/>
-          <w:sz w:val="26"/>
-          <w:szCs w:val="26"/>
-        </w:rPr>
-        <w:t xml:space="preserve">c) Thu nhập bình quân còn lại để trả gốc:</w:t>
-      </w:r>
-    </w:p>
-    <w:p>
-      <w:pPr>
-        <w:spacing w:before="120" w:after="120" w:line="276" w:lineRule="auto"/>
-        <w:jc w:val="both"/>
-        <w:rPr>
-          <w:rFonts w:ascii="Times New Roman" w:hAnsi="Times New Roman" w:cs="Times New Roman"/>
-          <w:sz w:val="26"/>
-          <w:szCs w:val="26"/>
-        </w:rPr>
-      </w:pPr>
-      <w:r>
-        <w:rPr>
-          <w:rFonts w:ascii="Times New Roman" w:hAnsi="Times New Roman" w:cs="Times New Roman"/>
-          <w:sz w:val="26"/>
-          <w:szCs w:val="26"/>
-        </w:rPr>
-        <w:t xml:space="preserve">[PA.Tổng thu nhập kỳ] đồng - [PA.Tổng chi phí kỳ] đồng = [PA.Dư trả gốc] đồng.</w:t>
-      </w:r>
-    </w:p>
-    <w:p>
-      <w:pPr>
-        <w:spacing w:before="120" w:after="120" w:line="276" w:lineRule="auto"/>
-        <w:jc w:val="both"/>
-        <w:rPr>
-          <w:rFonts w:ascii="Times New Roman" w:hAnsi="Times New Roman" w:cs="Times New Roman"/>
-          <w:sz w:val="26"/>
-          <w:szCs w:val="26"/>
-        </w:rPr>
-      </w:pPr>
-      <w:r>
-        <w:rPr>
-          <w:rFonts w:ascii="Times New Roman" w:hAnsi="Times New Roman" w:cs="Times New Roman"/>
-          <w:sz w:val="26"/>
-          <w:szCs w:val="26"/>
-        </w:rPr>
-        <w:t xml:space="preserve">d) Định kỳ trả nợ:</w:t>
-      </w:r>
-    </w:p>
-    <w:p>
-      <w:pPr>
-        <w:spacing w:before="120" w:after="120" w:line="276" w:lineRule="auto"/>
-        <w:jc w:val="both"/>
-        <w:rPr>
-          <w:rFonts w:ascii="Times New Roman" w:hAnsi="Times New Roman" w:cs="Times New Roman"/>
-          <w:sz w:val="26"/>
-          <w:szCs w:val="26"/>
-        </w:rPr>
-      </w:pPr>
-      <w:r>
-        <w:rPr>
-          <w:rFonts w:ascii="Times New Roman" w:hAnsi="Times New Roman" w:cs="Times New Roman"/>
-          <w:sz w:val="26"/>
-          <w:szCs w:val="26"/>
-        </w:rPr>
-        <w:t xml:space="preserve">- Trả lãi vay: hàng tháng;</w:t>
-      </w:r>
-    </w:p>
-    <w:p>
-      <w:pPr>
-        <w:spacing w:before="120" w:after="120" w:line="276" w:lineRule="auto"/>
-        <w:jc w:val="both"/>
-        <w:rPr>
-          <w:rFonts w:ascii="Times New Roman" w:hAnsi="Times New Roman" w:cs="Times New Roman"/>
-          <w:sz w:val="26"/>
-          <w:szCs w:val="26"/>
-        </w:rPr>
-      </w:pPr>
-      <w:r>
-        <w:rPr>
-          <w:rFonts w:ascii="Times New Roman" w:hAnsi="Times New Roman" w:cs="Times New Roman"/>
-          <w:sz w:val="26"/>
-          <w:szCs w:val="26"/>
-        </w:rPr>
-        <w:t xml:space="preserve">- Trả gốc: Khách hàng cam kết sử dụng nguồn thu nhập từ lương và phụ cấp của [PA.Mô tả người trả nợ] để trả nợ gốc cho khoản vay tại Agribank Lâm Đồng PGD Hòa Bình trong vòng [PA.Thời hạn vay text], trả gốc [PA.Kỳ hạn trả gốc text], mỗi kỳ trả [PA.Số tiền trả gốc mỗi kỳ] đồng. Thu nhập còn lại khách hàng sử dụng để trang trải các chi phí phát sinh khác.</w:t>
-      </w:r>
-    </w:p>
-    <w:p>
-      <w:pPr>
-        <w:spacing w:before="120" w:after="120" w:line="276" w:lineRule="auto"/>
-        <w:jc w:val="both"/>
-        <w:rPr>
-          <w:rFonts w:ascii="Times New Roman" w:hAnsi="Times New Roman" w:cs="Times New Roman"/>
-          <w:sz w:val="26"/>
-          <w:szCs w:val="26"/>
-        </w:rPr>
-      </w:pPr>
-      <w:r>
-        <w:rPr>
-          <w:rFonts w:ascii="Times New Roman" w:hAnsi="Times New Roman" w:cs="Times New Roman"/>
-          <w:sz w:val="26"/>
-          <w:szCs w:val="26"/>
-        </w:rPr>
-        <w:t xml:space="preserve">e) Thu nhập còn lại sau khi trả nợ:</w:t>
-      </w:r>
-    </w:p>
-    <w:p>
-      <w:pPr>
-        <w:spacing w:before="120" w:after="120" w:line="276" w:lineRule="auto"/>
-        <w:jc w:val="both"/>
-        <w:rPr>
-          <w:rFonts w:ascii="Times New Roman" w:hAnsi="Times New Roman" w:cs="Times New Roman"/>
-          <w:sz w:val="26"/>
-          <w:szCs w:val="26"/>
-        </w:rPr>
-      </w:pPr>
-      <w:r>
-        <w:rPr>
-          <w:rFonts w:ascii="Times New Roman" w:hAnsi="Times New Roman" w:cs="Times New Roman"/>
-          <w:sz w:val="26"/>
-          <w:szCs w:val="26"/>
-        </w:rPr>
-        <w:t xml:space="preserve">[PA.Dư trả gốc] đồng – [PA.Số tiền trả gốc mỗi kỳ] đồng = [PA.Thu nhập còn lại] đồng.</w:t>
-      </w:r>
-    </w:p>
-    <w:p>
-      <w:pPr>
         <w:widowControl w:val="0"/>
         <w:spacing w:after="0" w:line="276" w:lineRule="auto"/>
         <w:ind w:firstLine="567"/>
@@ -9252,107 +8982,286 @@
     </w:p>
     <w:p>
       <w:pPr>
-        <w:pStyle w:val="ListParagraph"/>
-        <w:spacing w:after="0" w:line="276" w:lineRule="auto"/>
-        <w:ind w:left="0" w:firstLine="567"/>
-        <w:contextualSpacing w:val="0"/>
-        <w:jc w:val="both"/>
-        <w:rPr>
-          <w:rFonts w:ascii="Times New Roman" w:eastAsia="Times New Roman" w:hAnsi="Times New Roman" w:cs="Times New Roman"/>
-          <w:sz w:val="26"/>
-          <w:szCs w:val="28"/>
-          <w:lang w:val="de-DE"/>
-        </w:rPr>
-      </w:pPr>
-      <w:r>
-        <w:rPr>
-          <w:rFonts w:ascii="Times New Roman" w:eastAsia="Times New Roman" w:hAnsi="Times New Roman" w:cs="Times New Roman"/>
-          <w:sz w:val="26"/>
-          <w:szCs w:val="28"/>
-          <w:lang w:val="de-DE"/>
-        </w:rPr>
-        <w:t>4</w:t>
-      </w:r>
-      <w:r>
-        <w:rPr>
-          <w:rFonts w:ascii="Times New Roman" w:eastAsia="Times New Roman" w:hAnsi="Times New Roman" w:cs="Times New Roman"/>
-          <w:sz w:val="26"/>
-          <w:szCs w:val="28"/>
-          <w:lang w:val="de-DE"/>
-        </w:rPr>
-        <w:t>.1</w:t>
-      </w:r>
-      <w:r>
-        <w:rPr>
-          <w:rFonts w:ascii="Times New Roman" w:eastAsia="Times New Roman" w:hAnsi="Times New Roman" w:cs="Times New Roman"/>
-          <w:sz w:val="26"/>
-          <w:szCs w:val="28"/>
-          <w:lang w:val="de-DE"/>
-        </w:rPr>
-        <w:t>.</w:t>
-      </w:r>
-      <w:r>
-        <w:rPr>
-          <w:rFonts w:ascii="Times New Roman" w:eastAsia="Times New Roman" w:hAnsi="Times New Roman" w:cs="Times New Roman"/>
-          <w:sz w:val="26"/>
-          <w:szCs w:val="28"/>
-          <w:lang w:val="de-DE"/>
-        </w:rPr>
-        <w:t xml:space="preserve"> Khả năng trả nợ của khách hàng:</w:t>
-      </w:r>
-    </w:p>
-    <w:p>
-      <w:pPr>
-        <w:pStyle w:val="ListParagraph"/>
-        <w:spacing w:after="0" w:line="276" w:lineRule="auto"/>
-        <w:ind w:left="0" w:firstLine="567"/>
-        <w:contextualSpacing w:val="0"/>
-        <w:jc w:val="both"/>
-        <w:rPr>
-          <w:rFonts w:ascii="Times New Roman" w:eastAsia="Times New Roman" w:hAnsi="Times New Roman" w:cs="Times New Roman"/>
+        <w:spacing w:after="0" w:line="276" w:lineRule="auto"/>
+        <w:ind w:firstLine="567"/>
+        <w:jc w:val="both"/>
+        <w:rPr>
+          <w:rFonts w:ascii="Times New Roman" w:hAnsi="Times New Roman" w:cs="Times New Roman"/>
           <w:b/>
           <w:bCs/>
-          <w:color w:val="EE0000"/>
-          <w:sz w:val="26"/>
-          <w:szCs w:val="28"/>
-          <w:lang w:val="de-DE"/>
-        </w:rPr>
-      </w:pPr>
-      <w:r>
-        <w:rPr>
-          <w:rFonts w:ascii="Times New Roman" w:eastAsia="Times New Roman" w:hAnsi="Times New Roman" w:cs="Times New Roman"/>
+          <w:sz w:val="26"/>
+          <w:szCs w:val="26"/>
+        </w:rPr>
+      </w:pPr>
+      <w:r>
+        <w:rPr>
+          <w:rFonts w:ascii="Times New Roman" w:hAnsi="Times New Roman" w:cs="Times New Roman"/>
           <w:b/>
           <w:bCs/>
-          <w:color w:val="EE0000"/>
-          <w:sz w:val="26"/>
-          <w:szCs w:val="28"/>
-          <w:lang w:val="de-DE"/>
-        </w:rPr>
-        <w:t>***</w:t>
-      </w:r>
-      <w:r>
-        <w:rPr>
-          <w:rFonts w:ascii="Times New Roman" w:eastAsia="Times New Roman" w:hAnsi="Times New Roman" w:cs="Times New Roman"/>
-          <w:b/>
-          <w:bCs/>
-          <w:color w:val="EE0000"/>
-          <w:sz w:val="26"/>
-          <w:szCs w:val="28"/>
-          <w:lang w:val="de-DE"/>
-        </w:rPr>
-        <w:t>Add phương án vào đây</w:t>
-      </w:r>
-      <w:r>
-        <w:rPr>
-          <w:rFonts w:ascii="Times New Roman" w:eastAsia="Times New Roman" w:hAnsi="Times New Roman" w:cs="Times New Roman"/>
-          <w:b/>
-          <w:bCs/>
-          <w:color w:val="EE0000"/>
-          <w:sz w:val="26"/>
-          <w:szCs w:val="28"/>
-          <w:lang w:val="de-DE"/>
-        </w:rPr>
-        <w:t>***</w:t>
+          <w:sz w:val="26"/>
+          <w:szCs w:val="26"/>
+        </w:rPr>
+        <w:t>4.1. Khả năng trả nợ của khách hàng:</w:t>
+      </w:r>
+    </w:p>
+    <w:p>
+      <w:pPr>
+        <w:spacing w:after="0" w:line="276" w:lineRule="auto"/>
+        <w:ind w:firstLine="567"/>
+        <w:jc w:val="both"/>
+        <w:rPr>
+          <w:rFonts w:ascii="Times New Roman" w:hAnsi="Times New Roman" w:cs="Times New Roman"/>
+          <w:sz w:val="26"/>
+          <w:szCs w:val="26"/>
+        </w:rPr>
+      </w:pPr>
+      <w:r>
+        <w:rPr>
+          <w:rFonts w:ascii="Times New Roman" w:hAnsi="Times New Roman" w:cs="Times New Roman"/>
+          <w:sz w:val="26"/>
+          <w:szCs w:val="26"/>
+        </w:rPr>
+        <w:t>a) Thu nhập để trả nợ: Từ lương và phụ cấp của [PA.Mô tả người trả nợ]. [PA.Câu thu nhập];</w:t>
+      </w:r>
+    </w:p>
+    <w:p>
+      <w:pPr>
+        <w:spacing w:after="0" w:line="276" w:lineRule="auto"/>
+        <w:ind w:firstLine="567"/>
+        <w:jc w:val="both"/>
+        <w:rPr>
+          <w:rFonts w:ascii="Times New Roman" w:hAnsi="Times New Roman" w:cs="Times New Roman"/>
+          <w:sz w:val="26"/>
+          <w:szCs w:val="26"/>
+        </w:rPr>
+      </w:pPr>
+      <w:r>
+        <w:rPr>
+          <w:rFonts w:ascii="Times New Roman" w:hAnsi="Times New Roman" w:cs="Times New Roman"/>
+          <w:sz w:val="26"/>
+          <w:szCs w:val="26"/>
+        </w:rPr>
+        <w:t>Tổng lương và phụ cấp bình quân trong [PA.Kỳ text]: [PA.Tổng thu nhập kỳ] đồng</w:t>
+      </w:r>
+    </w:p>
+    <w:p>
+      <w:pPr>
+        <w:spacing w:after="0" w:line="276" w:lineRule="auto"/>
+        <w:ind w:firstLine="567"/>
+        <w:jc w:val="both"/>
+        <w:rPr>
+          <w:rFonts w:ascii="Times New Roman" w:hAnsi="Times New Roman" w:cs="Times New Roman"/>
+          <w:sz w:val="26"/>
+          <w:szCs w:val="26"/>
+        </w:rPr>
+      </w:pPr>
+      <w:r>
+        <w:rPr>
+          <w:rFonts w:ascii="Times New Roman" w:hAnsi="Times New Roman" w:cs="Times New Roman"/>
+          <w:sz w:val="26"/>
+          <w:szCs w:val="26"/>
+        </w:rPr>
+        <w:t>b) Tổng chi phí bình quân trong [PA.Kỳ text]: [PA.Tổng chi phí kỳ] đồng, trong đó:</w:t>
+      </w:r>
+    </w:p>
+    <w:p>
+      <w:pPr>
+        <w:spacing w:after="0" w:line="276" w:lineRule="auto"/>
+        <w:ind w:firstLine="567"/>
+        <w:jc w:val="both"/>
+        <w:rPr>
+          <w:rFonts w:ascii="Times New Roman" w:hAnsi="Times New Roman" w:cs="Times New Roman"/>
+          <w:sz w:val="26"/>
+          <w:szCs w:val="26"/>
+        </w:rPr>
+      </w:pPr>
+      <w:r>
+        <w:rPr>
+          <w:rFonts w:ascii="Times New Roman" w:hAnsi="Times New Roman" w:cs="Times New Roman"/>
+          <w:sz w:val="26"/>
+          <w:szCs w:val="26"/>
+        </w:rPr>
+        <w:t>- Chi phí sinh hoạt bình quân trong [PA.Kỳ text]: [PA.Chi phí sinh hoạt kỳ] đồng;</w:t>
+      </w:r>
+    </w:p>
+    <w:p>
+      <w:pPr>
+        <w:spacing w:after="0" w:line="276" w:lineRule="auto"/>
+        <w:ind w:firstLine="567"/>
+        <w:jc w:val="both"/>
+        <w:rPr>
+          <w:rFonts w:ascii="Times New Roman" w:hAnsi="Times New Roman" w:cs="Times New Roman"/>
+          <w:sz w:val="26"/>
+          <w:szCs w:val="26"/>
+        </w:rPr>
+      </w:pPr>
+      <w:r>
+        <w:rPr>
+          <w:rFonts w:ascii="Times New Roman" w:hAnsi="Times New Roman" w:cs="Times New Roman"/>
+          <w:sz w:val="26"/>
+          <w:szCs w:val="26"/>
+        </w:rPr>
+        <w:t>- Chi phí lãi vay (lãi suất bình quân là [PA.Lãi suất vay khác]/năm): [PA.Chi phí lãi vay kỳ] đồng;</w:t>
+      </w:r>
+    </w:p>
+    <w:p>
+      <w:pPr>
+        <w:spacing w:after="0" w:line="276" w:lineRule="auto"/>
+        <w:ind w:firstLine="567"/>
+        <w:jc w:val="both"/>
+        <w:rPr>
+          <w:rFonts w:ascii="Times New Roman" w:hAnsi="Times New Roman" w:cs="Times New Roman"/>
+          <w:sz w:val="26"/>
+          <w:szCs w:val="26"/>
+        </w:rPr>
+      </w:pPr>
+      <w:r>
+        <w:rPr>
+          <w:rFonts w:ascii="Times New Roman" w:hAnsi="Times New Roman" w:cs="Times New Roman"/>
+          <w:sz w:val="26"/>
+          <w:szCs w:val="26"/>
+        </w:rPr>
+        <w:t>- Chi phí khác (các khoản vay khác;...): [PA.Chi phí khác kỳ] đồng.</w:t>
+      </w:r>
+    </w:p>
+    <w:p>
+      <w:pPr>
+        <w:spacing w:after="0" w:line="276" w:lineRule="auto"/>
+        <w:ind w:firstLine="567"/>
+        <w:jc w:val="both"/>
+        <w:rPr>
+          <w:rFonts w:ascii="Times New Roman" w:hAnsi="Times New Roman" w:cs="Times New Roman"/>
+          <w:sz w:val="26"/>
+          <w:szCs w:val="26"/>
+        </w:rPr>
+      </w:pPr>
+      <w:r>
+        <w:rPr>
+          <w:rFonts w:ascii="Times New Roman" w:hAnsi="Times New Roman" w:cs="Times New Roman"/>
+          <w:sz w:val="26"/>
+          <w:szCs w:val="26"/>
+        </w:rPr>
+        <w:t>c) Thu nhập bình quân còn lại để trả gốc:</w:t>
+      </w:r>
+    </w:p>
+    <w:p>
+      <w:pPr>
+        <w:spacing w:after="0" w:line="276" w:lineRule="auto"/>
+        <w:ind w:firstLine="567"/>
+        <w:jc w:val="both"/>
+        <w:rPr>
+          <w:rFonts w:ascii="Times New Roman" w:hAnsi="Times New Roman" w:cs="Times New Roman"/>
+          <w:sz w:val="26"/>
+          <w:szCs w:val="26"/>
+        </w:rPr>
+      </w:pPr>
+      <w:r>
+        <w:rPr>
+          <w:rFonts w:ascii="Times New Roman" w:hAnsi="Times New Roman" w:cs="Times New Roman"/>
+          <w:sz w:val="26"/>
+          <w:szCs w:val="26"/>
+        </w:rPr>
+        <w:t>[PA.Tổng thu nhập kỳ] đồng - [PA.Tổng chi phí kỳ] đồng = [PA.Dư trả gốc] đồng.</w:t>
+      </w:r>
+    </w:p>
+    <w:p>
+      <w:pPr>
+        <w:spacing w:after="0" w:line="276" w:lineRule="auto"/>
+        <w:ind w:firstLine="567"/>
+        <w:jc w:val="both"/>
+        <w:rPr>
+          <w:rFonts w:ascii="Times New Roman" w:hAnsi="Times New Roman" w:cs="Times New Roman"/>
+          <w:sz w:val="26"/>
+          <w:szCs w:val="26"/>
+        </w:rPr>
+      </w:pPr>
+      <w:r>
+        <w:rPr>
+          <w:rFonts w:ascii="Times New Roman" w:hAnsi="Times New Roman" w:cs="Times New Roman"/>
+          <w:sz w:val="26"/>
+          <w:szCs w:val="26"/>
+        </w:rPr>
+        <w:t>d) Định kỳ trả nợ:</w:t>
+      </w:r>
+    </w:p>
+    <w:p>
+      <w:pPr>
+        <w:spacing w:after="0" w:line="276" w:lineRule="auto"/>
+        <w:ind w:firstLine="567"/>
+        <w:jc w:val="both"/>
+        <w:rPr>
+          <w:rFonts w:ascii="Times New Roman" w:hAnsi="Times New Roman" w:cs="Times New Roman"/>
+          <w:sz w:val="26"/>
+          <w:szCs w:val="26"/>
+        </w:rPr>
+      </w:pPr>
+      <w:r>
+        <w:rPr>
+          <w:rFonts w:ascii="Times New Roman" w:hAnsi="Times New Roman" w:cs="Times New Roman"/>
+          <w:sz w:val="26"/>
+          <w:szCs w:val="26"/>
+        </w:rPr>
+        <w:t>- Trả lãi vay: hàng tháng;</w:t>
+      </w:r>
+    </w:p>
+    <w:p>
+      <w:pPr>
+        <w:spacing w:after="0" w:line="276" w:lineRule="auto"/>
+        <w:ind w:firstLine="567"/>
+        <w:jc w:val="both"/>
+        <w:rPr>
+          <w:rFonts w:ascii="Times New Roman" w:hAnsi="Times New Roman" w:cs="Times New Roman"/>
+          <w:sz w:val="26"/>
+          <w:szCs w:val="26"/>
+        </w:rPr>
+      </w:pPr>
+      <w:r>
+        <w:rPr>
+          <w:rFonts w:ascii="Times New Roman" w:hAnsi="Times New Roman" w:cs="Times New Roman"/>
+          <w:sz w:val="26"/>
+          <w:szCs w:val="26"/>
+        </w:rPr>
+        <w:t>- Trả gốc: Khách hàng cam kết sử dụng nguồn thu nhập từ lương và phụ cấp của [PA.Mô tả người trả nợ] để trả nợ gốc cho khoản vay tại Agribank Lâm Đồng PGD Hòa Bình trong vòng [PA.Thời hạn vay text], trả gốc [PA.Kỳ hạn trả gốc text], mỗi kỳ trả [PA.Số tiền trả gốc mỗi kỳ] đồng. Thu nhập còn lại khách hàng sử dụng để trang trải các chi phí phát sinh khác.</w:t>
+      </w:r>
+    </w:p>
+    <w:p>
+      <w:pPr>
+        <w:spacing w:after="0" w:line="276" w:lineRule="auto"/>
+        <w:ind w:firstLine="567"/>
+        <w:jc w:val="both"/>
+        <w:rPr>
+          <w:rFonts w:ascii="Times New Roman" w:hAnsi="Times New Roman" w:cs="Times New Roman"/>
+          <w:sz w:val="26"/>
+          <w:szCs w:val="26"/>
+        </w:rPr>
+      </w:pPr>
+      <w:r>
+        <w:rPr>
+          <w:rFonts w:ascii="Times New Roman" w:hAnsi="Times New Roman" w:cs="Times New Roman"/>
+          <w:sz w:val="26"/>
+          <w:szCs w:val="26"/>
+        </w:rPr>
+        <w:t>e) Thu nhập còn lại sau khi trả nợ:</w:t>
+      </w:r>
+    </w:p>
+    <w:p>
+      <w:pPr>
+        <w:spacing w:after="0" w:line="276" w:lineRule="auto"/>
+        <w:ind w:firstLine="567"/>
+        <w:jc w:val="both"/>
+        <w:rPr>
+          <w:rFonts w:ascii="Times New Roman" w:hAnsi="Times New Roman" w:cs="Times New Roman"/>
+          <w:sz w:val="26"/>
+          <w:szCs w:val="26"/>
+        </w:rPr>
+      </w:pPr>
+      <w:r>
+        <w:rPr>
+          <w:rFonts w:ascii="Times New Roman" w:hAnsi="Times New Roman" w:cs="Times New Roman"/>
+          <w:sz w:val="26"/>
+          <w:szCs w:val="26"/>
+        </w:rPr>
+        <w:t>[PA.Dư trả gốc] đồng – [PA.Số tiền trả gốc mỗi kỳ] đồng = [PA.Thu nhập còn lại] đồng.</w:t>
       </w:r>
     </w:p>
     <w:p>
@@ -9546,6 +9455,7 @@
           <w:szCs w:val="28"/>
           <w:lang w:val="de-DE"/>
         </w:rPr>
+        <w:lastRenderedPageBreak/>
         <w:t xml:space="preserve">* </w:t>
       </w:r>
       <w:r>
@@ -10396,7 +10306,6 @@
           <w:szCs w:val="28"/>
           <w:lang w:val="fr-FR"/>
         </w:rPr>
-        <w:lastRenderedPageBreak/>
         <w:t>- Mức cho vay có bảo đảm bằng tài sản:</w:t>
       </w:r>
       <w:r>

</xml_diff>

<commit_message>
feat: ĐS loop for movable collateral in BCĐX tiêu dùng template
- Builder: emit ĐS.* aliases per loop item to prevent docxtemplater
  scope leak (same fix pattern as UNC). Add 4 common metadata fields
  shared with QSDĐ (Tình trạng sử dụng TS, Tên chủ sở hữu TS,
  Khái quát về lợi thế, Thời hạn sử dụng).
- Template: inject [#ĐS]...[/ĐS] loop with vehicle details (a-f)
  after [/TSBD_CHI_TIET], 2-column layout for spec fields.
</commit_message>
<xml_diff>
--- a/report_assets/KHCN templates/Báo cáo đề xuất/2268.02A BCDXCV tieu dung co TSBD.docx
+++ b/report_assets/KHCN templates/Báo cáo đề xuất/2268.02A BCDXCV tieu dung co TSBD.docx
@@ -105,7 +105,7 @@
                 </mc:Choice>
                 <mc:Fallback>
                   <w:pict>
-                    <v:line w14:anchorId="5D1E9223" id="Straight Connector 1" o:spid="_x0000_s1026" style="position:absolute;z-index:251662336;visibility:visible;mso-wrap-style:square;mso-wrap-distance-left:9pt;mso-wrap-distance-top:0;mso-wrap-distance-right:9pt;mso-wrap-distance-bottom:0;mso-position-horizontal:center;mso-position-horizontal-relative:margin;mso-position-vertical:absolute;mso-position-vertical-relative:text" from="0,16.5pt" to="108pt,16.5pt" o:gfxdata="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">
+                    <v:line w14:anchorId="2F612909" id="Straight Connector 1" o:spid="_x0000_s1026" style="position:absolute;z-index:251662336;visibility:visible;mso-wrap-style:square;mso-wrap-distance-left:9pt;mso-wrap-distance-top:0;mso-wrap-distance-right:9pt;mso-wrap-distance-bottom:0;mso-position-horizontal:center;mso-position-horizontal-relative:margin;mso-position-vertical:absolute;mso-position-vertical-relative:text" from="0,16.5pt" to="108pt,16.5pt" o:gfxdata="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">
                       <w10:wrap anchorx="margin"/>
                     </v:line>
                   </w:pict>
@@ -257,7 +257,7 @@
                 </mc:Choice>
                 <mc:Fallback>
                   <w:pict>
-                    <v:shapetype w14:anchorId="37A2A5CE" id="_x0000_t32" coordsize="21600,21600" o:spt="32" o:oned="t" path="m,l21600,21600e" filled="f">
+                    <v:shapetype w14:anchorId="531C5221" id="_x0000_t32" coordsize="21600,21600" o:spt="32" o:oned="t" path="m,l21600,21600e" filled="f">
                       <v:path arrowok="t" fillok="f" o:connecttype="none"/>
                       <o:lock v:ext="edit" shapetype="t"/>
                     </v:shapetype>
@@ -6090,6 +6090,336 @@
           <w:szCs w:val="26"/>
         </w:rPr>
         <w:t>[/TSBD_CHI_TIET]</w:t>
+      </w:r>
+    </w:p>
+    <w:p>
+      <w:pPr>
+        <w:spacing w:before="60" w:after="60" w:line="276" w:lineRule="auto"/>
+        <w:jc w:val="both"/>
+        <w:rPr>
+          <w:rFonts w:ascii="Times New Roman" w:hAnsi="Times New Roman" w:cs="Times New Roman"/>
+          <w:sz w:val="26"/>
+          <w:szCs w:val="26"/>
+        </w:rPr>
+      </w:pPr>
+      <w:r>
+        <w:rPr>
+          <w:rFonts w:ascii="Times New Roman" w:hAnsi="Times New Roman" w:cs="Times New Roman"/>
+          <w:sz w:val="26"/>
+          <w:szCs w:val="26"/>
+        </w:rPr>
+        <w:t xml:space="preserve">[#ĐS]</w:t>
+      </w:r>
+    </w:p>
+    <w:p>
+      <w:pPr>
+        <w:spacing w:before="60" w:after="60" w:line="276" w:lineRule="auto"/>
+        <w:jc w:val="both"/>
+        <w:rPr>
+          <w:rFonts w:ascii="Times New Roman" w:hAnsi="Times New Roman" w:cs="Times New Roman"/>
+          <w:sz w:val="26"/>
+          <w:szCs w:val="26"/>
+        </w:rPr>
+      </w:pPr>
+      <w:r>
+        <w:rPr>
+          <w:rFonts w:ascii="Times New Roman" w:hAnsi="Times New Roman" w:cs="Times New Roman"/>
+          <w:sz w:val="26"/>
+          <w:szCs w:val="26"/>
+        </w:rPr>
+        <w:t xml:space="preserve">a) Chi tiết tài sản (theo Giấy chứng nhận đăng ký xe ô tô số [ĐS.Giấy đăng ký số] do [ĐS.Cơ quan cấp] cấp ngày [ĐS.Cấp ngày])</w:t>
+      </w:r>
+    </w:p>
+    <w:p>
+      <w:pPr>
+        <w:spacing w:before="60" w:after="60" w:line="276" w:lineRule="auto"/>
+        <w:jc w:val="both"/>
+        <w:rPr>
+          <w:rFonts w:ascii="Times New Roman" w:hAnsi="Times New Roman" w:cs="Times New Roman"/>
+          <w:sz w:val="26"/>
+          <w:szCs w:val="26"/>
+        </w:rPr>
+      </w:pPr>
+      <w:r>
+        <w:rPr>
+          <w:rFonts w:ascii="Times New Roman" w:hAnsi="Times New Roman" w:cs="Times New Roman"/>
+          <w:sz w:val="26"/>
+          <w:szCs w:val="26"/>
+        </w:rPr>
+        <w:t xml:space="preserve">Nhãn hiệu: [ĐS.Nhãn hiệu]</w:t>
+      </w:r>
+      <w:r>
+        <w:rPr>
+          <w:rFonts w:ascii="Times New Roman" w:hAnsi="Times New Roman" w:cs="Times New Roman"/>
+          <w:sz w:val="26"/>
+          <w:szCs w:val="26"/>
+        </w:rPr>
+        <w:tab/>
+      </w:r>
+      <w:r>
+        <w:rPr>
+          <w:rFonts w:ascii="Times New Roman" w:hAnsi="Times New Roman" w:cs="Times New Roman"/>
+          <w:sz w:val="26"/>
+          <w:szCs w:val="26"/>
+        </w:rPr>
+        <w:t xml:space="preserve">Số loại: [ĐS.Số loại]</w:t>
+      </w:r>
+    </w:p>
+    <w:p>
+      <w:pPr>
+        <w:spacing w:before="60" w:after="60" w:line="276" w:lineRule="auto"/>
+        <w:jc w:val="both"/>
+        <w:rPr>
+          <w:rFonts w:ascii="Times New Roman" w:hAnsi="Times New Roman" w:cs="Times New Roman"/>
+          <w:sz w:val="26"/>
+          <w:szCs w:val="26"/>
+        </w:rPr>
+      </w:pPr>
+      <w:r>
+        <w:rPr>
+          <w:rFonts w:ascii="Times New Roman" w:hAnsi="Times New Roman" w:cs="Times New Roman"/>
+          <w:sz w:val="26"/>
+          <w:szCs w:val="26"/>
+        </w:rPr>
+        <w:t xml:space="preserve">Màu sơn: [ĐS.Màu sơn]</w:t>
+      </w:r>
+      <w:r>
+        <w:rPr>
+          <w:rFonts w:ascii="Times New Roman" w:hAnsi="Times New Roman" w:cs="Times New Roman"/>
+          <w:sz w:val="26"/>
+          <w:szCs w:val="26"/>
+        </w:rPr>
+        <w:tab/>
+      </w:r>
+      <w:r>
+        <w:rPr>
+          <w:rFonts w:ascii="Times New Roman" w:hAnsi="Times New Roman" w:cs="Times New Roman"/>
+          <w:sz w:val="26"/>
+          <w:szCs w:val="26"/>
+        </w:rPr>
+        <w:t xml:space="preserve">Số máy: [ĐS.Số máy]</w:t>
+      </w:r>
+    </w:p>
+    <w:p>
+      <w:pPr>
+        <w:spacing w:before="60" w:after="60" w:line="276" w:lineRule="auto"/>
+        <w:jc w:val="both"/>
+        <w:rPr>
+          <w:rFonts w:ascii="Times New Roman" w:hAnsi="Times New Roman" w:cs="Times New Roman"/>
+          <w:sz w:val="26"/>
+          <w:szCs w:val="26"/>
+        </w:rPr>
+      </w:pPr>
+      <w:r>
+        <w:rPr>
+          <w:rFonts w:ascii="Times New Roman" w:hAnsi="Times New Roman" w:cs="Times New Roman"/>
+          <w:sz w:val="26"/>
+          <w:szCs w:val="26"/>
+        </w:rPr>
+        <w:t xml:space="preserve">Năm sản xuất: [ĐS.Năm sản xuất]</w:t>
+      </w:r>
+      <w:r>
+        <w:rPr>
+          <w:rFonts w:ascii="Times New Roman" w:hAnsi="Times New Roman" w:cs="Times New Roman"/>
+          <w:sz w:val="26"/>
+          <w:szCs w:val="26"/>
+        </w:rPr>
+        <w:tab/>
+      </w:r>
+      <w:r>
+        <w:rPr>
+          <w:rFonts w:ascii="Times New Roman" w:hAnsi="Times New Roman" w:cs="Times New Roman"/>
+          <w:sz w:val="26"/>
+          <w:szCs w:val="26"/>
+        </w:rPr>
+        <w:t xml:space="preserve">Số khung: [ĐS.Số khung]</w:t>
+      </w:r>
+    </w:p>
+    <w:p>
+      <w:pPr>
+        <w:spacing w:before="60" w:after="60" w:line="276" w:lineRule="auto"/>
+        <w:jc w:val="both"/>
+        <w:rPr>
+          <w:rFonts w:ascii="Times New Roman" w:hAnsi="Times New Roman" w:cs="Times New Roman"/>
+          <w:sz w:val="26"/>
+          <w:szCs w:val="26"/>
+        </w:rPr>
+      </w:pPr>
+      <w:r>
+        <w:rPr>
+          <w:rFonts w:ascii="Times New Roman" w:hAnsi="Times New Roman" w:cs="Times New Roman"/>
+          <w:sz w:val="26"/>
+          <w:szCs w:val="26"/>
+        </w:rPr>
+        <w:t xml:space="preserve">Biển kiểm soát: [ĐS.Biển kiểm soát]</w:t>
+      </w:r>
+      <w:r>
+        <w:rPr>
+          <w:rFonts w:ascii="Times New Roman" w:hAnsi="Times New Roman" w:cs="Times New Roman"/>
+          <w:sz w:val="26"/>
+          <w:szCs w:val="26"/>
+        </w:rPr>
+        <w:tab/>
+      </w:r>
+      <w:r>
+        <w:rPr>
+          <w:rFonts w:ascii="Times New Roman" w:hAnsi="Times New Roman" w:cs="Times New Roman"/>
+          <w:sz w:val="26"/>
+          <w:szCs w:val="26"/>
+        </w:rPr>
+        <w:t xml:space="preserve">Số chỗ ngồi: [ĐS.Số chỗ ngồi]</w:t>
+      </w:r>
+    </w:p>
+    <w:p>
+      <w:pPr>
+        <w:spacing w:before="60" w:after="60" w:line="276" w:lineRule="auto"/>
+        <w:jc w:val="both"/>
+        <w:rPr>
+          <w:rFonts w:ascii="Times New Roman" w:hAnsi="Times New Roman" w:cs="Times New Roman"/>
+          <w:sz w:val="26"/>
+          <w:szCs w:val="26"/>
+        </w:rPr>
+      </w:pPr>
+      <w:r>
+        <w:rPr>
+          <w:rFonts w:ascii="Times New Roman" w:hAnsi="Times New Roman" w:cs="Times New Roman"/>
+          <w:sz w:val="26"/>
+          <w:szCs w:val="26"/>
+        </w:rPr>
+        <w:t xml:space="preserve">b) Xác định tình trạng tài sản: [ĐS.Tình trạng sử dụng TS]</w:t>
+      </w:r>
+    </w:p>
+    <w:p>
+      <w:pPr>
+        <w:spacing w:before="60" w:after="60" w:line="276" w:lineRule="auto"/>
+        <w:jc w:val="both"/>
+        <w:rPr>
+          <w:rFonts w:ascii="Times New Roman" w:hAnsi="Times New Roman" w:cs="Times New Roman"/>
+          <w:sz w:val="26"/>
+          <w:szCs w:val="26"/>
+        </w:rPr>
+      </w:pPr>
+      <w:r>
+        <w:rPr>
+          <w:rFonts w:ascii="Times New Roman" w:hAnsi="Times New Roman" w:cs="Times New Roman"/>
+          <w:sz w:val="26"/>
+          <w:szCs w:val="26"/>
+        </w:rPr>
+        <w:t xml:space="preserve">c) Xác định tính tranh chấp của tài sản:</w:t>
+      </w:r>
+    </w:p>
+    <w:p>
+      <w:pPr>
+        <w:spacing w:before="60" w:after="60" w:line="276" w:lineRule="auto"/>
+        <w:jc w:val="both"/>
+        <w:rPr>
+          <w:rFonts w:ascii="Times New Roman" w:hAnsi="Times New Roman" w:cs="Times New Roman"/>
+          <w:sz w:val="26"/>
+          <w:szCs w:val="26"/>
+        </w:rPr>
+      </w:pPr>
+      <w:r>
+        <w:rPr>
+          <w:rFonts w:ascii="Times New Roman" w:hAnsi="Times New Roman" w:cs="Times New Roman"/>
+          <w:sz w:val="26"/>
+          <w:szCs w:val="26"/>
+        </w:rPr>
+        <w:t xml:space="preserve">- Người sử dụng đồng thời là chủ sở hữu tài sản: [ĐS.Tên chủ sở hữu TS].</w:t>
+      </w:r>
+    </w:p>
+    <w:p>
+      <w:pPr>
+        <w:spacing w:before="60" w:after="60" w:line="276" w:lineRule="auto"/>
+        <w:jc w:val="both"/>
+        <w:rPr>
+          <w:rFonts w:ascii="Times New Roman" w:hAnsi="Times New Roman" w:cs="Times New Roman"/>
+          <w:sz w:val="26"/>
+          <w:szCs w:val="26"/>
+        </w:rPr>
+      </w:pPr>
+      <w:r>
+        <w:rPr>
+          <w:rFonts w:ascii="Times New Roman" w:hAnsi="Times New Roman" w:cs="Times New Roman"/>
+          <w:sz w:val="26"/>
+          <w:szCs w:val="26"/>
+        </w:rPr>
+        <w:t xml:space="preserve">- Tại thời điểm thẩm định, tài sản không có tranh chấp, toàn bộ thuộc tài sản thế chấp.</w:t>
+      </w:r>
+    </w:p>
+    <w:p>
+      <w:pPr>
+        <w:spacing w:before="60" w:after="60" w:line="276" w:lineRule="auto"/>
+        <w:jc w:val="both"/>
+        <w:rPr>
+          <w:rFonts w:ascii="Times New Roman" w:hAnsi="Times New Roman" w:cs="Times New Roman"/>
+          <w:sz w:val="26"/>
+          <w:szCs w:val="26"/>
+        </w:rPr>
+      </w:pPr>
+      <w:r>
+        <w:rPr>
+          <w:rFonts w:ascii="Times New Roman" w:hAnsi="Times New Roman" w:cs="Times New Roman"/>
+          <w:sz w:val="26"/>
+          <w:szCs w:val="26"/>
+        </w:rPr>
+        <w:t xml:space="preserve">d) Tính thanh khoản: [ĐS.Khái quát về lợi thế]</w:t>
+      </w:r>
+    </w:p>
+    <w:p>
+      <w:pPr>
+        <w:spacing w:before="60" w:after="60" w:line="276" w:lineRule="auto"/>
+        <w:jc w:val="both"/>
+        <w:rPr>
+          <w:rFonts w:ascii="Times New Roman" w:hAnsi="Times New Roman" w:cs="Times New Roman"/>
+          <w:sz w:val="26"/>
+          <w:szCs w:val="26"/>
+        </w:rPr>
+      </w:pPr>
+      <w:r>
+        <w:rPr>
+          <w:rFonts w:ascii="Times New Roman" w:hAnsi="Times New Roman" w:cs="Times New Roman"/>
+          <w:sz w:val="26"/>
+          <w:szCs w:val="26"/>
+        </w:rPr>
+        <w:t xml:space="preserve">e) Mua bảo hiểm TSBĐ: [ĐS.Mua bảo hiểm TSBĐ]</w:t>
+      </w:r>
+    </w:p>
+    <w:p>
+      <w:pPr>
+        <w:spacing w:before="60" w:after="60" w:line="276" w:lineRule="auto"/>
+        <w:jc w:val="both"/>
+        <w:rPr>
+          <w:rFonts w:ascii="Times New Roman" w:hAnsi="Times New Roman" w:cs="Times New Roman"/>
+          <w:sz w:val="26"/>
+          <w:szCs w:val="26"/>
+        </w:rPr>
+      </w:pPr>
+      <w:r>
+        <w:rPr>
+          <w:rFonts w:ascii="Times New Roman" w:hAnsi="Times New Roman" w:cs="Times New Roman"/>
+          <w:sz w:val="26"/>
+          <w:szCs w:val="26"/>
+        </w:rPr>
+        <w:t xml:space="preserve">f) Thời hạn sử dụng còn lại: [ĐS.Thời hạn sử dụng]</w:t>
+      </w:r>
+    </w:p>
+    <w:p>
+      <w:pPr>
+        <w:spacing w:before="60" w:after="60" w:line="276" w:lineRule="auto"/>
+        <w:jc w:val="both"/>
+        <w:rPr>
+          <w:rFonts w:ascii="Times New Roman" w:hAnsi="Times New Roman" w:cs="Times New Roman"/>
+          <w:sz w:val="26"/>
+          <w:szCs w:val="26"/>
+        </w:rPr>
+      </w:pPr>
+      <w:r>
+        <w:rPr>
+          <w:rFonts w:ascii="Times New Roman" w:hAnsi="Times New Roman" w:cs="Times New Roman"/>
+          <w:sz w:val="26"/>
+          <w:szCs w:val="26"/>
+        </w:rPr>
+        <w:t xml:space="preserve">[/ĐS]</w:t>
       </w:r>
     </w:p>
     <w:p>

</xml_diff>

<commit_message>
chore: update BCDXCV tiêu dùng template
</commit_message>
<xml_diff>
--- a/report_assets/KHCN templates/Báo cáo đề xuất/2268.02A BCDXCV tieu dung co TSBD.docx
+++ b/report_assets/KHCN templates/Báo cáo đề xuất/2268.02A BCDXCV tieu dung co TSBD.docx
@@ -105,7 +105,7 @@
                 </mc:Choice>
                 <mc:Fallback>
                   <w:pict>
-                    <v:line w14:anchorId="3841128C" id="Straight Connector 1" o:spid="_x0000_s1026" style="position:absolute;z-index:251662336;visibility:visible;mso-wrap-style:square;mso-wrap-distance-left:9pt;mso-wrap-distance-top:0;mso-wrap-distance-right:9pt;mso-wrap-distance-bottom:0;mso-position-horizontal:center;mso-position-horizontal-relative:margin;mso-position-vertical:absolute;mso-position-vertical-relative:text" from="0,16.5pt" to="108pt,16.5pt" o:gfxdata="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">
+                    <v:line w14:anchorId="51DEFD51" id="Straight Connector 1" o:spid="_x0000_s1026" style="position:absolute;z-index:251662336;visibility:visible;mso-wrap-style:square;mso-wrap-distance-left:9pt;mso-wrap-distance-top:0;mso-wrap-distance-right:9pt;mso-wrap-distance-bottom:0;mso-position-horizontal:center;mso-position-horizontal-relative:margin;mso-position-vertical:absolute;mso-position-vertical-relative:text" from="0,16.5pt" to="108pt,16.5pt" o:gfxdata="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">
                       <w10:wrap anchorx="margin"/>
                     </v:line>
                   </w:pict>
@@ -257,7 +257,7 @@
                 </mc:Choice>
                 <mc:Fallback>
                   <w:pict>
-                    <v:shapetype w14:anchorId="2DD81799" id="_x0000_t32" coordsize="21600,21600" o:spt="32" o:oned="t" path="m,l21600,21600e" filled="f">
+                    <v:shapetype w14:anchorId="03654C1C" id="_x0000_t32" coordsize="21600,21600" o:spt="32" o:oned="t" path="m,l21600,21600e" filled="f">
                       <v:path arrowok="t" fillok="f" o:connecttype="none"/>
                       <o:lock v:ext="edit" shapetype="t"/>
                     </v:shapetype>

</xml_diff>

<commit_message>
feat: add loan method selector, 36-month review section, and Mẫu 20 template
- Add loan_method field to loan UI (selector badge, detail header, new/edit forms)
- Add Mẫu 20 HMTD-CN template for 36-month credit limit review
- Add review-36-months section with actual vs planned comparison table
- Add HĐTD placeholder group for 36-month review data in DOCX builder
- Add loan plan selector modal for customer detail view
- Update DOCX templates with latest placeholder changes
</commit_message>
<xml_diff>
--- a/report_assets/KHCN templates/Báo cáo đề xuất/2268.02A BCDXCV tieu dung co TSBD.docx
+++ b/report_assets/KHCN templates/Báo cáo đề xuất/2268.02A BCDXCV tieu dung co TSBD.docx
@@ -105,7 +105,7 @@
                 </mc:Choice>
                 <mc:Fallback>
                   <w:pict>
-                    <v:line w14:anchorId="51DEFD51" id="Straight Connector 1" o:spid="_x0000_s1026" style="position:absolute;z-index:251662336;visibility:visible;mso-wrap-style:square;mso-wrap-distance-left:9pt;mso-wrap-distance-top:0;mso-wrap-distance-right:9pt;mso-wrap-distance-bottom:0;mso-position-horizontal:center;mso-position-horizontal-relative:margin;mso-position-vertical:absolute;mso-position-vertical-relative:text" from="0,16.5pt" to="108pt,16.5pt" o:gfxdata="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">
+                    <v:line w14:anchorId="2558442D" id="Straight Connector 1" o:spid="_x0000_s1026" style="position:absolute;z-index:251662336;visibility:visible;mso-wrap-style:square;mso-wrap-distance-left:9pt;mso-wrap-distance-top:0;mso-wrap-distance-right:9pt;mso-wrap-distance-bottom:0;mso-position-horizontal:center;mso-position-horizontal-relative:margin;mso-position-vertical:absolute;mso-position-vertical-relative:text" from="0,16.5pt" to="108pt,16.5pt" o:gfxdata="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">
                       <w10:wrap anchorx="margin"/>
                     </v:line>
                   </w:pict>
@@ -257,7 +257,7 @@
                 </mc:Choice>
                 <mc:Fallback>
                   <w:pict>
-                    <v:shapetype w14:anchorId="03654C1C" id="_x0000_t32" coordsize="21600,21600" o:spt="32" o:oned="t" path="m,l21600,21600e" filled="f">
+                    <v:shapetype w14:anchorId="3F97BAB4" id="_x0000_t32" coordsize="21600,21600" o:spt="32" o:oned="t" path="m,l21600,21600e" filled="f">
                       <v:path arrowok="t" fillok="f" o:connecttype="none"/>
                       <o:lock v:ext="edit" shapetype="t"/>
                     </v:shapetype>
@@ -6181,6 +6181,14 @@
           <w:sz w:val="26"/>
           <w:szCs w:val="26"/>
         </w:rPr>
+        <w:tab/>
+      </w:r>
+      <w:r>
+        <w:rPr>
+          <w:rFonts w:ascii="Times New Roman" w:hAnsi="Times New Roman" w:cs="Times New Roman"/>
+          <w:sz w:val="26"/>
+          <w:szCs w:val="26"/>
+        </w:rPr>
         <w:t>Số loại: [ĐS.Số loại]</w:t>
       </w:r>
     </w:p>
@@ -6233,6 +6241,14 @@
           <w:sz w:val="26"/>
           <w:szCs w:val="26"/>
         </w:rPr>
+        <w:tab/>
+      </w:r>
+      <w:r>
+        <w:rPr>
+          <w:rFonts w:ascii="Times New Roman" w:hAnsi="Times New Roman" w:cs="Times New Roman"/>
+          <w:sz w:val="26"/>
+          <w:szCs w:val="26"/>
+        </w:rPr>
         <w:t>Số máy: [ĐS.Số máy]</w:t>
       </w:r>
     </w:p>
@@ -6277,6 +6293,14 @@
           <w:sz w:val="26"/>
           <w:szCs w:val="26"/>
         </w:rPr>
+        <w:tab/>
+      </w:r>
+      <w:r>
+        <w:rPr>
+          <w:rFonts w:ascii="Times New Roman" w:hAnsi="Times New Roman" w:cs="Times New Roman"/>
+          <w:sz w:val="26"/>
+          <w:szCs w:val="26"/>
+        </w:rPr>
         <w:t>Số khung: [ĐS.Số khung]</w:t>
       </w:r>
     </w:p>
@@ -6306,6 +6330,21 @@
           <w:szCs w:val="26"/>
         </w:rPr>
         <w:tab/>
+      </w:r>
+      <w:r>
+        <w:rPr>
+          <w:rFonts w:ascii="Times New Roman" w:hAnsi="Times New Roman" w:cs="Times New Roman"/>
+          <w:sz w:val="26"/>
+          <w:szCs w:val="26"/>
+        </w:rPr>
+        <w:tab/>
+      </w:r>
+      <w:r>
+        <w:rPr>
+          <w:rFonts w:ascii="Times New Roman" w:hAnsi="Times New Roman" w:cs="Times New Roman"/>
+          <w:sz w:val="26"/>
+          <w:szCs w:val="26"/>
+        </w:rPr>
         <w:t>Số chỗ ngồi: [ĐS.Số chỗ ngồi]</w:t>
       </w:r>
     </w:p>
@@ -8243,69 +8282,14 @@
           <w:szCs w:val="27"/>
         </w:rPr>
       </w:pPr>
-    </w:p>
-    <w:p>
-      <w:pPr>
-        <w:shd w:val="clear" w:color="auto" w:fill="FFFFFF"/>
-        <w:spacing w:after="0" w:line="276" w:lineRule="auto"/>
-        <w:ind w:firstLine="567"/>
-        <w:jc w:val="both"/>
+      <w:r>
         <w:rPr>
           <w:rFonts w:ascii="Times New Roman" w:eastAsia="Calibri" w:hAnsi="Times New Roman" w:cs="Times New Roman"/>
           <w:b/>
           <w:sz w:val="26"/>
           <w:szCs w:val="27"/>
         </w:rPr>
-      </w:pPr>
-    </w:p>
-    <w:p>
-      <w:pPr>
-        <w:shd w:val="clear" w:color="auto" w:fill="FFFFFF"/>
-        <w:spacing w:after="0" w:line="276" w:lineRule="auto"/>
-        <w:ind w:firstLine="567"/>
-        <w:jc w:val="both"/>
-        <w:rPr>
-          <w:rFonts w:ascii="Times New Roman" w:eastAsia="Calibri" w:hAnsi="Times New Roman" w:cs="Times New Roman"/>
-          <w:b/>
-          <w:sz w:val="26"/>
-          <w:szCs w:val="27"/>
-        </w:rPr>
-      </w:pPr>
-    </w:p>
-    <w:p>
-      <w:pPr>
-        <w:shd w:val="clear" w:color="auto" w:fill="FFFFFF"/>
-        <w:spacing w:after="0" w:line="276" w:lineRule="auto"/>
-        <w:ind w:firstLine="567"/>
-        <w:jc w:val="both"/>
-        <w:rPr>
-          <w:rFonts w:ascii="Times New Roman" w:eastAsia="Calibri" w:hAnsi="Times New Roman" w:cs="Times New Roman"/>
-          <w:b/>
-          <w:sz w:val="26"/>
-          <w:szCs w:val="27"/>
-        </w:rPr>
-      </w:pPr>
-    </w:p>
-    <w:p>
-      <w:pPr>
-        <w:shd w:val="clear" w:color="auto" w:fill="FFFFFF"/>
-        <w:spacing w:after="0" w:line="276" w:lineRule="auto"/>
-        <w:ind w:firstLine="567"/>
-        <w:jc w:val="both"/>
-        <w:rPr>
-          <w:rFonts w:ascii="Times New Roman" w:eastAsia="Calibri" w:hAnsi="Times New Roman" w:cs="Times New Roman"/>
-          <w:b/>
-          <w:sz w:val="26"/>
-          <w:szCs w:val="27"/>
-        </w:rPr>
-      </w:pPr>
-      <w:r>
-        <w:rPr>
-          <w:rFonts w:ascii="Times New Roman" w:eastAsia="Calibri" w:hAnsi="Times New Roman" w:cs="Times New Roman"/>
-          <w:b/>
-          <w:sz w:val="26"/>
-          <w:szCs w:val="27"/>
-        </w:rPr>
+        <w:lastRenderedPageBreak/>
         <w:t>B. PHẦN THẨM ĐỊNH VÀ ĐỀ XUẤT CHO VAY CỦA NGƯỜI THẨM ĐỊNH</w:t>
       </w:r>
     </w:p>
@@ -9659,28 +9643,36 @@
           <w:sz w:val="26"/>
           <w:szCs w:val="26"/>
         </w:rPr>
+        <w:t>- Trả lãi vay: hàng tháng;</w:t>
+      </w:r>
+    </w:p>
+    <w:p>
+      <w:pPr>
+        <w:spacing w:after="0" w:line="276" w:lineRule="auto"/>
+        <w:ind w:firstLine="567"/>
+        <w:jc w:val="both"/>
+        <w:rPr>
+          <w:rFonts w:ascii="Times New Roman" w:hAnsi="Times New Roman" w:cs="Times New Roman"/>
+          <w:sz w:val="26"/>
+          <w:szCs w:val="26"/>
+        </w:rPr>
+      </w:pPr>
+      <w:r>
+        <w:rPr>
+          <w:rFonts w:ascii="Times New Roman" w:hAnsi="Times New Roman" w:cs="Times New Roman"/>
+          <w:sz w:val="26"/>
+          <w:szCs w:val="26"/>
+        </w:rPr>
+        <w:t xml:space="preserve">- Trả gốc: Khách hàng cam kết sử dụng nguồn thu nhập từ lương và phụ cấp của [PA.Mô tả người trả nợ] để trả nợ gốc cho khoản vay tại Agribank Lâm Đồng PGD Hòa Bình trong vòng [PA.Thời hạn vay text], trả gốc [PA.Kỳ hạn trả gốc text], mỗi kỳ trả </w:t>
+      </w:r>
+      <w:r>
+        <w:rPr>
+          <w:rFonts w:ascii="Times New Roman" w:hAnsi="Times New Roman" w:cs="Times New Roman"/>
+          <w:sz w:val="26"/>
+          <w:szCs w:val="26"/>
+        </w:rPr>
         <w:lastRenderedPageBreak/>
-        <w:t>- Trả lãi vay: hàng tháng;</w:t>
-      </w:r>
-    </w:p>
-    <w:p>
-      <w:pPr>
-        <w:spacing w:after="0" w:line="276" w:lineRule="auto"/>
-        <w:ind w:firstLine="567"/>
-        <w:jc w:val="both"/>
-        <w:rPr>
-          <w:rFonts w:ascii="Times New Roman" w:hAnsi="Times New Roman" w:cs="Times New Roman"/>
-          <w:sz w:val="26"/>
-          <w:szCs w:val="26"/>
-        </w:rPr>
-      </w:pPr>
-      <w:r>
-        <w:rPr>
-          <w:rFonts w:ascii="Times New Roman" w:hAnsi="Times New Roman" w:cs="Times New Roman"/>
-          <w:sz w:val="26"/>
-          <w:szCs w:val="26"/>
-        </w:rPr>
-        <w:t>- Trả gốc: Khách hàng cam kết sử dụng nguồn thu nhập từ lương và phụ cấp của [PA.Mô tả người trả nợ] để trả nợ gốc cho khoản vay tại Agribank Lâm Đồng PGD Hòa Bình trong vòng [PA.Thời hạn vay text], trả gốc [PA.Kỳ hạn trả gốc text], mỗi kỳ trả [PA.Số tiền trả gốc mỗi kỳ] đồng. Thu nhập còn lại khách hàng sử dụng để trang trải các chi phí phát sinh khác.</w:t>
+        <w:t>[PA.Số tiền trả gốc mỗi kỳ] đồng. Thu nhập còn lại khách hàng sử dụng để trang trải các chi phí phát sinh khác.</w:t>
       </w:r>
     </w:p>
     <w:p>
@@ -10960,7 +10952,6 @@
           <w:szCs w:val="28"/>
           <w:lang w:val="pt-BR"/>
         </w:rPr>
-        <w:lastRenderedPageBreak/>
         <w:t>Trên cơ sở hồ sơ vay vốn, đề xuất của Người quan hệ khách hàng, Người thẩm định đã tiến hành thẩm định và đề xuất như sau:</w:t>
       </w:r>
     </w:p>
@@ -11089,6 +11080,7 @@
           <w:szCs w:val="28"/>
           <w:lang w:val="pt-BR"/>
         </w:rPr>
+        <w:lastRenderedPageBreak/>
         <w:t>- Phương thức cho vay: Từng lần</w:t>
       </w:r>
       <w:r>
@@ -11227,7 +11219,7 @@
           <w:szCs w:val="28"/>
           <w:lang w:val="pt-BR"/>
         </w:rPr>
-        <w:t xml:space="preserve">vay: [HĐTD.Lãi suất vay]%/năm. </w:t>
+        <w:t xml:space="preserve">vay: [HĐTD.Lãi suất vay]. </w:t>
       </w:r>
       <w:r>
         <w:rPr>
@@ -11279,7 +11271,7 @@
       <w:pPr>
         <w:shd w:val="clear" w:color="auto" w:fill="FFFFFF"/>
         <w:tabs>
-          <w:tab w:val="left" w:leader="dot" w:pos="9356"/>
+          <w:tab w:val="left" w:leader="dot" w:pos="9072"/>
         </w:tabs>
         <w:spacing w:after="0" w:line="276" w:lineRule="auto"/>
         <w:ind w:firstLine="567"/>
@@ -11307,8 +11299,95 @@
           <w:szCs w:val="28"/>
           <w:lang w:val="pt-BR"/>
         </w:rPr>
-        <w:t>n: [HĐTD.Phí trả nợ trước hạn]</w:t>
-      </w:r>
+        <w:t xml:space="preserve">n: </w:t>
+      </w:r>
+    </w:p>
+    <w:p>
+      <w:pPr>
+        <w:shd w:val="clear" w:color="auto" w:fill="FFFFFF"/>
+        <w:tabs>
+          <w:tab w:val="left" w:leader="dot" w:pos="9072"/>
+        </w:tabs>
+        <w:spacing w:after="0" w:line="276" w:lineRule="auto"/>
+        <w:ind w:firstLine="851"/>
+        <w:jc w:val="both"/>
+        <w:rPr>
+          <w:rFonts w:ascii="Times New Roman" w:eastAsia="Times New Roman" w:hAnsi="Times New Roman" w:cs="Times New Roman"/>
+          <w:sz w:val="26"/>
+          <w:szCs w:val="28"/>
+          <w:lang w:val="pt-BR"/>
+        </w:rPr>
+      </w:pPr>
+      <w:r>
+        <w:rPr>
+          <w:rFonts w:ascii="Times New Roman" w:eastAsia="Times New Roman" w:hAnsi="Times New Roman" w:cs="Times New Roman"/>
+          <w:sz w:val="26"/>
+          <w:szCs w:val="28"/>
+          <w:lang w:val="pt-BR"/>
+        </w:rPr>
+        <w:t>+</w:t>
+      </w:r>
+      <w:r>
+        <w:rPr>
+          <w:rFonts w:ascii="Times New Roman" w:eastAsia="Times New Roman" w:hAnsi="Times New Roman" w:cs="Times New Roman"/>
+          <w:sz w:val="26"/>
+          <w:szCs w:val="28"/>
+          <w:lang w:val="pt-BR"/>
+        </w:rPr>
+        <w:t xml:space="preserve"> Trường hợp vay trả trong ngày: [HDTD.Phí vay trả trong ngày]/Số tiền trả trước hạn; Tối thiểu [HDTD.Min vay trả trong ngày] đồng; Tối đa [HDTD.Max vay trả trong ngày] đồng.</w:t>
+      </w:r>
+    </w:p>
+    <w:p>
+      <w:pPr>
+        <w:shd w:val="clear" w:color="auto" w:fill="FFFFFF"/>
+        <w:tabs>
+          <w:tab w:val="left" w:leader="dot" w:pos="9072"/>
+        </w:tabs>
+        <w:spacing w:after="0" w:line="276" w:lineRule="auto"/>
+        <w:ind w:firstLine="851"/>
+        <w:jc w:val="both"/>
+        <w:rPr>
+          <w:rFonts w:ascii="Times New Roman" w:eastAsia="Times New Roman" w:hAnsi="Times New Roman" w:cs="Times New Roman"/>
+          <w:sz w:val="26"/>
+          <w:szCs w:val="28"/>
+          <w:lang w:val="pt-BR"/>
+        </w:rPr>
+      </w:pPr>
+      <w:r>
+        <w:rPr>
+          <w:rFonts w:ascii="Times New Roman" w:eastAsia="Times New Roman" w:hAnsi="Times New Roman" w:cs="Times New Roman"/>
+          <w:sz w:val="26"/>
+          <w:szCs w:val="28"/>
+          <w:lang w:val="pt-BR"/>
+        </w:rPr>
+        <w:t>+</w:t>
+      </w:r>
+      <w:r>
+        <w:rPr>
+          <w:rFonts w:ascii="Times New Roman" w:eastAsia="Times New Roman" w:hAnsi="Times New Roman" w:cs="Times New Roman"/>
+          <w:sz w:val="26"/>
+          <w:szCs w:val="28"/>
+          <w:lang w:val="pt-BR"/>
+        </w:rPr>
+        <w:t xml:space="preserve"> Trường hợp trả nợ trước hạn (áp dụng số ngày vay &gt;1 ngày) tính trên số tiền trả trước và thời gian trả trước:</w:t>
+      </w:r>
+    </w:p>
+    <w:p>
+      <w:pPr>
+        <w:shd w:val="clear" w:color="auto" w:fill="FFFFFF"/>
+        <w:tabs>
+          <w:tab w:val="left" w:leader="dot" w:pos="9072"/>
+        </w:tabs>
+        <w:spacing w:after="0" w:line="276" w:lineRule="auto"/>
+        <w:ind w:firstLine="1134"/>
+        <w:jc w:val="both"/>
+        <w:rPr>
+          <w:rFonts w:ascii="Times New Roman" w:eastAsia="Times New Roman" w:hAnsi="Times New Roman" w:cs="Times New Roman"/>
+          <w:sz w:val="26"/>
+          <w:szCs w:val="28"/>
+          <w:lang w:val="pt-BR"/>
+        </w:rPr>
+      </w:pPr>
       <w:r>
         <w:rPr>
           <w:rFonts w:ascii="Times New Roman" w:eastAsia="Times New Roman" w:hAnsi="Times New Roman" w:cs="Times New Roman"/>
@@ -11317,6 +11396,85 @@
           <w:lang w:val="pt-BR"/>
         </w:rPr>
         <w:t>.</w:t>
+      </w:r>
+      <w:r>
+        <w:rPr>
+          <w:rFonts w:ascii="Times New Roman" w:eastAsia="Times New Roman" w:hAnsi="Times New Roman" w:cs="Times New Roman"/>
+          <w:sz w:val="26"/>
+          <w:szCs w:val="28"/>
+          <w:lang w:val="pt-BR"/>
+        </w:rPr>
+        <w:t xml:space="preserve"> Trả nợ trước hạn trong năm đầu: [HDTD.Phí trả trước năm 1]/số tiền trả nợ trước hạn; Tối thiểu [HDTD.Min trả trước năm 1] đồng; Tối đa [HDTD.Max trả trước năm 1] đồng.</w:t>
+      </w:r>
+    </w:p>
+    <w:p>
+      <w:pPr>
+        <w:shd w:val="clear" w:color="auto" w:fill="FFFFFF"/>
+        <w:tabs>
+          <w:tab w:val="left" w:leader="dot" w:pos="9072"/>
+        </w:tabs>
+        <w:spacing w:after="0" w:line="276" w:lineRule="auto"/>
+        <w:ind w:firstLine="1134"/>
+        <w:jc w:val="both"/>
+        <w:rPr>
+          <w:rFonts w:ascii="Times New Roman" w:eastAsia="Times New Roman" w:hAnsi="Times New Roman" w:cs="Times New Roman"/>
+          <w:sz w:val="26"/>
+          <w:szCs w:val="28"/>
+          <w:lang w:val="pt-BR"/>
+        </w:rPr>
+      </w:pPr>
+      <w:r>
+        <w:rPr>
+          <w:rFonts w:ascii="Times New Roman" w:eastAsia="Times New Roman" w:hAnsi="Times New Roman" w:cs="Times New Roman"/>
+          <w:sz w:val="26"/>
+          <w:szCs w:val="28"/>
+          <w:lang w:val="pt-BR"/>
+        </w:rPr>
+        <w:t>.</w:t>
+      </w:r>
+      <w:r>
+        <w:rPr>
+          <w:rFonts w:ascii="Times New Roman" w:eastAsia="Times New Roman" w:hAnsi="Times New Roman" w:cs="Times New Roman"/>
+          <w:sz w:val="26"/>
+          <w:szCs w:val="28"/>
+          <w:lang w:val="pt-BR"/>
+        </w:rPr>
+        <w:t xml:space="preserve"> Trả nợ trước hạn trong năm thứ hai: [HDTD.Phí trả trước năm 2]/số tiền trả nợ trước hạn; Tối thiểu [HDTD.Min trả trước năm 2] đồng; Tối đa [HDTD.Max trả trước năm 2] đồng.</w:t>
+      </w:r>
+    </w:p>
+    <w:p>
+      <w:pPr>
+        <w:shd w:val="clear" w:color="auto" w:fill="FFFFFF"/>
+        <w:tabs>
+          <w:tab w:val="left" w:leader="dot" w:pos="9072"/>
+        </w:tabs>
+        <w:spacing w:after="0" w:line="276" w:lineRule="auto"/>
+        <w:ind w:firstLine="1134"/>
+        <w:jc w:val="both"/>
+        <w:rPr>
+          <w:rFonts w:ascii="Times New Roman" w:eastAsia="Times New Roman" w:hAnsi="Times New Roman" w:cs="Times New Roman"/>
+          <w:sz w:val="26"/>
+          <w:szCs w:val="28"/>
+          <w:lang w:val="pt-BR"/>
+        </w:rPr>
+      </w:pPr>
+      <w:r>
+        <w:rPr>
+          <w:rFonts w:ascii="Times New Roman" w:eastAsia="Times New Roman" w:hAnsi="Times New Roman" w:cs="Times New Roman"/>
+          <w:sz w:val="26"/>
+          <w:szCs w:val="28"/>
+          <w:lang w:val="pt-BR"/>
+        </w:rPr>
+        <w:t>.</w:t>
+      </w:r>
+      <w:r>
+        <w:rPr>
+          <w:rFonts w:ascii="Times New Roman" w:eastAsia="Times New Roman" w:hAnsi="Times New Roman" w:cs="Times New Roman"/>
+          <w:sz w:val="26"/>
+          <w:szCs w:val="28"/>
+          <w:lang w:val="pt-BR"/>
+        </w:rPr>
+        <w:t xml:space="preserve"> Trả nợ trước hạn trong năm thứ ba trở đi: [HDTD.Phí trả trước năm 3+]/số tiền trả nợ trước hạn; Tối thiểu [HDTD.Min trả trước năm 3+] đồng; Tối đa [HDTD.Max trả trước năm 3+] đồng.</w:t>
       </w:r>
     </w:p>
     <w:p>
@@ -11866,7 +12024,7 @@
           <w:szCs w:val="28"/>
           <w:lang w:val="pt-BR"/>
         </w:rPr>
-        <w:t xml:space="preserve">- Lãi suất vay: [HĐTD.Lãi suất vay]%/năm. Lãi suất quá hạn: </w:t>
+        <w:t xml:space="preserve">- Lãi suất vay: [HĐTD.Lãi suất vay]. Lãi suất quá hạn: </w:t>
       </w:r>
       <w:r>
         <w:rPr>
@@ -11903,6 +12061,217 @@
           <w:lang w:val="pt-BR"/>
         </w:rPr>
         <w:t>;</w:t>
+      </w:r>
+    </w:p>
+    <w:p>
+      <w:pPr>
+        <w:shd w:val="clear" w:color="auto" w:fill="FFFFFF"/>
+        <w:tabs>
+          <w:tab w:val="left" w:leader="dot" w:pos="9072"/>
+        </w:tabs>
+        <w:spacing w:after="0" w:line="276" w:lineRule="auto"/>
+        <w:ind w:firstLine="567"/>
+        <w:jc w:val="both"/>
+        <w:rPr>
+          <w:rFonts w:ascii="Times New Roman" w:eastAsia="Times New Roman" w:hAnsi="Times New Roman" w:cs="Times New Roman"/>
+          <w:sz w:val="26"/>
+          <w:szCs w:val="28"/>
+          <w:lang w:val="pt-BR"/>
+        </w:rPr>
+      </w:pPr>
+      <w:r>
+        <w:rPr>
+          <w:rFonts w:ascii="Times New Roman" w:eastAsia="Times New Roman" w:hAnsi="Times New Roman" w:cs="Times New Roman"/>
+          <w:sz w:val="26"/>
+          <w:szCs w:val="28"/>
+          <w:lang w:val="pt-BR"/>
+        </w:rPr>
+        <w:t>- Phí trả nợ trước hạ</w:t>
+      </w:r>
+      <w:r>
+        <w:rPr>
+          <w:rFonts w:ascii="Times New Roman" w:eastAsia="Times New Roman" w:hAnsi="Times New Roman" w:cs="Times New Roman"/>
+          <w:sz w:val="26"/>
+          <w:szCs w:val="28"/>
+          <w:lang w:val="pt-BR"/>
+        </w:rPr>
+        <w:t xml:space="preserve">n: </w:t>
+      </w:r>
+    </w:p>
+    <w:p>
+      <w:pPr>
+        <w:shd w:val="clear" w:color="auto" w:fill="FFFFFF"/>
+        <w:tabs>
+          <w:tab w:val="left" w:leader="dot" w:pos="9072"/>
+        </w:tabs>
+        <w:spacing w:after="0" w:line="276" w:lineRule="auto"/>
+        <w:ind w:firstLine="851"/>
+        <w:jc w:val="both"/>
+        <w:rPr>
+          <w:rFonts w:ascii="Times New Roman" w:eastAsia="Times New Roman" w:hAnsi="Times New Roman" w:cs="Times New Roman"/>
+          <w:sz w:val="26"/>
+          <w:szCs w:val="28"/>
+          <w:lang w:val="pt-BR"/>
+        </w:rPr>
+      </w:pPr>
+      <w:r>
+        <w:rPr>
+          <w:rFonts w:ascii="Times New Roman" w:eastAsia="Times New Roman" w:hAnsi="Times New Roman" w:cs="Times New Roman"/>
+          <w:sz w:val="26"/>
+          <w:szCs w:val="28"/>
+          <w:lang w:val="pt-BR"/>
+        </w:rPr>
+        <w:lastRenderedPageBreak/>
+        <w:t>+</w:t>
+      </w:r>
+      <w:r>
+        <w:rPr>
+          <w:rFonts w:ascii="Times New Roman" w:eastAsia="Times New Roman" w:hAnsi="Times New Roman" w:cs="Times New Roman"/>
+          <w:sz w:val="26"/>
+          <w:szCs w:val="28"/>
+          <w:lang w:val="pt-BR"/>
+        </w:rPr>
+        <w:t xml:space="preserve"> Trường hợp vay trả trong ngày: [HDTD.Phí vay trả trong ngày]/Số tiền trả trước hạn; Tối thiểu [HDTD.Min vay trả trong ngày] đồng; Tối đa [HDTD.Max vay trả trong ngày] đồng.</w:t>
+      </w:r>
+    </w:p>
+    <w:p>
+      <w:pPr>
+        <w:shd w:val="clear" w:color="auto" w:fill="FFFFFF"/>
+        <w:tabs>
+          <w:tab w:val="left" w:leader="dot" w:pos="9072"/>
+        </w:tabs>
+        <w:spacing w:after="0" w:line="276" w:lineRule="auto"/>
+        <w:ind w:firstLine="851"/>
+        <w:jc w:val="both"/>
+        <w:rPr>
+          <w:rFonts w:ascii="Times New Roman" w:eastAsia="Times New Roman" w:hAnsi="Times New Roman" w:cs="Times New Roman"/>
+          <w:sz w:val="26"/>
+          <w:szCs w:val="28"/>
+          <w:lang w:val="pt-BR"/>
+        </w:rPr>
+      </w:pPr>
+      <w:r>
+        <w:rPr>
+          <w:rFonts w:ascii="Times New Roman" w:eastAsia="Times New Roman" w:hAnsi="Times New Roman" w:cs="Times New Roman"/>
+          <w:sz w:val="26"/>
+          <w:szCs w:val="28"/>
+          <w:lang w:val="pt-BR"/>
+        </w:rPr>
+        <w:t>+</w:t>
+      </w:r>
+      <w:r>
+        <w:rPr>
+          <w:rFonts w:ascii="Times New Roman" w:eastAsia="Times New Roman" w:hAnsi="Times New Roman" w:cs="Times New Roman"/>
+          <w:sz w:val="26"/>
+          <w:szCs w:val="28"/>
+          <w:lang w:val="pt-BR"/>
+        </w:rPr>
+        <w:t xml:space="preserve"> Trường hợp trả nợ trước hạn (áp dụng số ngày vay &gt;1 ngày) tính trên số tiền trả trước và thời gian trả trước:</w:t>
+      </w:r>
+    </w:p>
+    <w:p>
+      <w:pPr>
+        <w:shd w:val="clear" w:color="auto" w:fill="FFFFFF"/>
+        <w:tabs>
+          <w:tab w:val="left" w:leader="dot" w:pos="9072"/>
+        </w:tabs>
+        <w:spacing w:after="0" w:line="276" w:lineRule="auto"/>
+        <w:ind w:firstLine="1134"/>
+        <w:jc w:val="both"/>
+        <w:rPr>
+          <w:rFonts w:ascii="Times New Roman" w:eastAsia="Times New Roman" w:hAnsi="Times New Roman" w:cs="Times New Roman"/>
+          <w:sz w:val="26"/>
+          <w:szCs w:val="28"/>
+          <w:lang w:val="pt-BR"/>
+        </w:rPr>
+      </w:pPr>
+      <w:r>
+        <w:rPr>
+          <w:rFonts w:ascii="Times New Roman" w:eastAsia="Times New Roman" w:hAnsi="Times New Roman" w:cs="Times New Roman"/>
+          <w:sz w:val="26"/>
+          <w:szCs w:val="28"/>
+          <w:lang w:val="pt-BR"/>
+        </w:rPr>
+        <w:t>.</w:t>
+      </w:r>
+      <w:r>
+        <w:rPr>
+          <w:rFonts w:ascii="Times New Roman" w:eastAsia="Times New Roman" w:hAnsi="Times New Roman" w:cs="Times New Roman"/>
+          <w:sz w:val="26"/>
+          <w:szCs w:val="28"/>
+          <w:lang w:val="pt-BR"/>
+        </w:rPr>
+        <w:t xml:space="preserve"> Trả nợ trước hạn trong năm đầu: [HDTD.Phí trả trước năm 1]/số tiền trả nợ trước hạn; Tối thiểu [HDTD.Min trả trước năm 1] đồng; Tối đa [HDTD.Max trả trước năm 1] đồng.</w:t>
+      </w:r>
+    </w:p>
+    <w:p>
+      <w:pPr>
+        <w:shd w:val="clear" w:color="auto" w:fill="FFFFFF"/>
+        <w:tabs>
+          <w:tab w:val="left" w:leader="dot" w:pos="9072"/>
+        </w:tabs>
+        <w:spacing w:after="0" w:line="276" w:lineRule="auto"/>
+        <w:ind w:firstLine="1134"/>
+        <w:jc w:val="both"/>
+        <w:rPr>
+          <w:rFonts w:ascii="Times New Roman" w:eastAsia="Times New Roman" w:hAnsi="Times New Roman" w:cs="Times New Roman"/>
+          <w:sz w:val="26"/>
+          <w:szCs w:val="28"/>
+          <w:lang w:val="pt-BR"/>
+        </w:rPr>
+      </w:pPr>
+      <w:r>
+        <w:rPr>
+          <w:rFonts w:ascii="Times New Roman" w:eastAsia="Times New Roman" w:hAnsi="Times New Roman" w:cs="Times New Roman"/>
+          <w:sz w:val="26"/>
+          <w:szCs w:val="28"/>
+          <w:lang w:val="pt-BR"/>
+        </w:rPr>
+        <w:t>.</w:t>
+      </w:r>
+      <w:r>
+        <w:rPr>
+          <w:rFonts w:ascii="Times New Roman" w:eastAsia="Times New Roman" w:hAnsi="Times New Roman" w:cs="Times New Roman"/>
+          <w:sz w:val="26"/>
+          <w:szCs w:val="28"/>
+          <w:lang w:val="pt-BR"/>
+        </w:rPr>
+        <w:t xml:space="preserve"> Trả nợ trước hạn trong năm thứ hai: [HDTD.Phí trả trước năm 2]/số tiền trả nợ trước hạn; Tối thiểu [HDTD.Min trả trước năm 2] đồng; Tối đa [HDTD.Max trả trước năm 2] đồng.</w:t>
+      </w:r>
+    </w:p>
+    <w:p>
+      <w:pPr>
+        <w:shd w:val="clear" w:color="auto" w:fill="FFFFFF"/>
+        <w:tabs>
+          <w:tab w:val="left" w:leader="dot" w:pos="9072"/>
+        </w:tabs>
+        <w:spacing w:after="0" w:line="276" w:lineRule="auto"/>
+        <w:ind w:firstLine="1134"/>
+        <w:jc w:val="both"/>
+        <w:rPr>
+          <w:rFonts w:ascii="Times New Roman" w:eastAsia="Times New Roman" w:hAnsi="Times New Roman" w:cs="Times New Roman"/>
+          <w:sz w:val="26"/>
+          <w:szCs w:val="28"/>
+          <w:lang w:val="pt-BR"/>
+        </w:rPr>
+      </w:pPr>
+      <w:r>
+        <w:rPr>
+          <w:rFonts w:ascii="Times New Roman" w:eastAsia="Times New Roman" w:hAnsi="Times New Roman" w:cs="Times New Roman"/>
+          <w:sz w:val="26"/>
+          <w:szCs w:val="28"/>
+          <w:lang w:val="pt-BR"/>
+        </w:rPr>
+        <w:t>.</w:t>
+      </w:r>
+      <w:r>
+        <w:rPr>
+          <w:rFonts w:ascii="Times New Roman" w:eastAsia="Times New Roman" w:hAnsi="Times New Roman" w:cs="Times New Roman"/>
+          <w:sz w:val="26"/>
+          <w:szCs w:val="28"/>
+          <w:lang w:val="pt-BR"/>
+        </w:rPr>
+        <w:t xml:space="preserve"> Trả nợ trước hạn trong năm thứ ba trở đi: [HDTD.Phí trả trước năm 3+]/số tiền trả nợ trước hạn; Tối thiểu [HDTD.Min trả trước năm 3+] đồng; Tối đa [HDTD.Max trả trước năm 3+] đồng.</w:t>
       </w:r>
     </w:p>
     <w:p>
@@ -11915,29 +12284,18 @@
         <w:ind w:firstLine="567"/>
         <w:jc w:val="both"/>
         <w:rPr>
-          <w:rFonts w:ascii="Times New Roman" w:eastAsia="Times New Roman" w:hAnsi="Times New Roman" w:cs="Times New Roman"/>
-          <w:sz w:val="26"/>
-          <w:szCs w:val="28"/>
-          <w:lang w:val="pt-BR"/>
-        </w:rPr>
-      </w:pPr>
-      <w:r>
-        <w:rPr>
-          <w:rFonts w:ascii="Times New Roman" w:eastAsia="Times New Roman" w:hAnsi="Times New Roman" w:cs="Times New Roman"/>
-          <w:sz w:val="26"/>
-          <w:szCs w:val="28"/>
-          <w:lang w:val="pt-BR"/>
-        </w:rPr>
-        <w:t>- Phí trả nợ trước hạ</w:t>
-      </w:r>
-      <w:r>
-        <w:rPr>
-          <w:rFonts w:ascii="Times New Roman" w:eastAsia="Times New Roman" w:hAnsi="Times New Roman" w:cs="Times New Roman"/>
-          <w:sz w:val="26"/>
-          <w:szCs w:val="28"/>
-          <w:lang w:val="pt-BR"/>
-        </w:rPr>
-        <w:t>n: [HĐTD.Phí trả nợ trước hạn].</w:t>
+          <w:rFonts w:ascii="Times New Roman" w:eastAsia="Calibri" w:hAnsi="Times New Roman" w:cs="Times New Roman"/>
+          <w:sz w:val="26"/>
+          <w:szCs w:val="28"/>
+        </w:rPr>
+      </w:pPr>
+      <w:r>
+        <w:rPr>
+          <w:rFonts w:ascii="Times New Roman" w:eastAsia="Calibri" w:hAnsi="Times New Roman" w:cs="Times New Roman"/>
+          <w:sz w:val="26"/>
+          <w:szCs w:val="28"/>
+        </w:rPr>
+        <w:t>- Tài sản bảo đảm: Cho vay có bảo đảm 100% bằng tài sản.</w:t>
       </w:r>
     </w:p>
     <w:p>
@@ -11950,30 +12308,6 @@
         <w:ind w:firstLine="567"/>
         <w:jc w:val="both"/>
         <w:rPr>
-          <w:rFonts w:ascii="Times New Roman" w:eastAsia="Calibri" w:hAnsi="Times New Roman" w:cs="Times New Roman"/>
-          <w:sz w:val="26"/>
-          <w:szCs w:val="28"/>
-        </w:rPr>
-      </w:pPr>
-      <w:r>
-        <w:rPr>
-          <w:rFonts w:ascii="Times New Roman" w:eastAsia="Calibri" w:hAnsi="Times New Roman" w:cs="Times New Roman"/>
-          <w:sz w:val="26"/>
-          <w:szCs w:val="28"/>
-        </w:rPr>
-        <w:t>- Tài sản bảo đảm: Cho vay có bảo đảm 100% bằng tài sản.</w:t>
-      </w:r>
-    </w:p>
-    <w:p>
-      <w:pPr>
-        <w:shd w:val="clear" w:color="auto" w:fill="FFFFFF"/>
-        <w:tabs>
-          <w:tab w:val="left" w:leader="dot" w:pos="9356"/>
-        </w:tabs>
-        <w:spacing w:after="0" w:line="276" w:lineRule="auto"/>
-        <w:ind w:firstLine="567"/>
-        <w:jc w:val="both"/>
-        <w:rPr>
           <w:rFonts w:ascii="Times New Roman" w:eastAsia="Times New Roman" w:hAnsi="Times New Roman" w:cs="Times New Roman"/>
           <w:sz w:val="26"/>
           <w:szCs w:val="28"/>
@@ -11988,6 +12322,15 @@
           <w:lang w:val="pt-BR"/>
         </w:rPr>
         <w:t xml:space="preserve">- </w:t>
+      </w:r>
+      <w:r>
+        <w:rPr>
+          <w:rFonts w:ascii="Times New Roman" w:eastAsia="Times New Roman" w:hAnsi="Times New Roman" w:cs="Times New Roman"/>
+          <w:sz w:val="26"/>
+          <w:szCs w:val="28"/>
+          <w:lang w:val="pt-BR"/>
+        </w:rPr>
+        <w:t xml:space="preserve">Điều kiện bổ sung: </w:t>
       </w:r>
       <w:r>
         <w:rPr>

</xml_diff>

<commit_message>
chore: update KHCN templates 2268.02A/B, remove sample report files
</commit_message>
<xml_diff>
--- a/report_assets/KHCN templates/Báo cáo đề xuất/2268.02A BCDXCV tieu dung co TSBD.docx
+++ b/report_assets/KHCN templates/Báo cáo đề xuất/2268.02A BCDXCV tieu dung co TSBD.docx
@@ -105,7 +105,7 @@
                 </mc:Choice>
                 <mc:Fallback>
                   <w:pict>
-                    <v:line w14:anchorId="2558442D" id="Straight Connector 1" o:spid="_x0000_s1026" style="position:absolute;z-index:251662336;visibility:visible;mso-wrap-style:square;mso-wrap-distance-left:9pt;mso-wrap-distance-top:0;mso-wrap-distance-right:9pt;mso-wrap-distance-bottom:0;mso-position-horizontal:center;mso-position-horizontal-relative:margin;mso-position-vertical:absolute;mso-position-vertical-relative:text" from="0,16.5pt" to="108pt,16.5pt" o:gfxdata="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">
+                    <v:line w14:anchorId="65816ED3" id="Straight Connector 1" o:spid="_x0000_s1026" style="position:absolute;z-index:251662336;visibility:visible;mso-wrap-style:square;mso-wrap-distance-left:9pt;mso-wrap-distance-top:0;mso-wrap-distance-right:9pt;mso-wrap-distance-bottom:0;mso-position-horizontal:center;mso-position-horizontal-relative:margin;mso-position-vertical:absolute;mso-position-vertical-relative:text" from="0,16.5pt" to="108pt,16.5pt" o:gfxdata="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">
                       <w10:wrap anchorx="margin"/>
                     </v:line>
                   </w:pict>
@@ -257,7 +257,7 @@
                 </mc:Choice>
                 <mc:Fallback>
                   <w:pict>
-                    <v:shapetype w14:anchorId="3F97BAB4" id="_x0000_t32" coordsize="21600,21600" o:spt="32" o:oned="t" path="m,l21600,21600e" filled="f">
+                    <v:shapetype w14:anchorId="1EA834C6" id="_x0000_t32" coordsize="21600,21600" o:spt="32" o:oned="t" path="m,l21600,21600e" filled="f">
                       <v:path arrowok="t" fillok="f" o:connecttype="none"/>
                       <o:lock v:ext="edit" shapetype="t"/>
                     </v:shapetype>
@@ -6126,415 +6126,476 @@
       <w:r>
         <w:rPr>
           <w:rFonts w:ascii="Times New Roman" w:hAnsi="Times New Roman" w:cs="Times New Roman"/>
-          <w:sz w:val="26"/>
-          <w:szCs w:val="26"/>
-        </w:rPr>
-        <w:t>a) Chi tiết tài sản (theo Giấy chứng nhận đăng ký xe ô tô số [ĐS.Giấy đăng ký số] do [ĐS.Cơ quan cấp] cấp ngày [ĐS.Cấp ngày])</w:t>
-      </w:r>
-    </w:p>
-    <w:p>
-      <w:pPr>
-        <w:spacing w:before="60" w:after="60" w:line="276" w:lineRule="auto"/>
-        <w:ind w:firstLine="567"/>
-        <w:jc w:val="both"/>
-        <w:rPr>
-          <w:rFonts w:ascii="Times New Roman" w:hAnsi="Times New Roman" w:cs="Times New Roman"/>
-          <w:sz w:val="26"/>
-          <w:szCs w:val="26"/>
-        </w:rPr>
-      </w:pPr>
-      <w:r>
-        <w:rPr>
-          <w:rFonts w:ascii="Times New Roman" w:hAnsi="Times New Roman" w:cs="Times New Roman"/>
-          <w:sz w:val="26"/>
-          <w:szCs w:val="26"/>
-        </w:rPr>
-        <w:t>Nhãn hiệu: [ĐS.Nhãn hiệu]</w:t>
-      </w:r>
-      <w:r>
-        <w:rPr>
-          <w:rFonts w:ascii="Times New Roman" w:hAnsi="Times New Roman" w:cs="Times New Roman"/>
-          <w:sz w:val="26"/>
-          <w:szCs w:val="26"/>
-        </w:rPr>
-        <w:tab/>
-      </w:r>
-      <w:r>
-        <w:rPr>
-          <w:rFonts w:ascii="Times New Roman" w:hAnsi="Times New Roman" w:cs="Times New Roman"/>
-          <w:sz w:val="26"/>
-          <w:szCs w:val="26"/>
-        </w:rPr>
-        <w:tab/>
-      </w:r>
-      <w:r>
-        <w:rPr>
-          <w:rFonts w:ascii="Times New Roman" w:hAnsi="Times New Roman" w:cs="Times New Roman"/>
-          <w:sz w:val="26"/>
-          <w:szCs w:val="26"/>
-        </w:rPr>
-        <w:tab/>
-      </w:r>
-      <w:r>
-        <w:rPr>
-          <w:rFonts w:ascii="Times New Roman" w:hAnsi="Times New Roman" w:cs="Times New Roman"/>
-          <w:sz w:val="26"/>
-          <w:szCs w:val="26"/>
-        </w:rPr>
-        <w:tab/>
-      </w:r>
-      <w:r>
-        <w:rPr>
-          <w:rFonts w:ascii="Times New Roman" w:hAnsi="Times New Roman" w:cs="Times New Roman"/>
-          <w:sz w:val="26"/>
-          <w:szCs w:val="26"/>
-        </w:rPr>
-        <w:t>Số loại: [ĐS.Số loại]</w:t>
-      </w:r>
-    </w:p>
-    <w:p>
-      <w:pPr>
-        <w:spacing w:before="60" w:after="60" w:line="276" w:lineRule="auto"/>
-        <w:ind w:firstLine="567"/>
-        <w:jc w:val="both"/>
-        <w:rPr>
-          <w:rFonts w:ascii="Times New Roman" w:hAnsi="Times New Roman" w:cs="Times New Roman"/>
-          <w:sz w:val="26"/>
-          <w:szCs w:val="26"/>
-        </w:rPr>
-      </w:pPr>
-      <w:r>
-        <w:rPr>
-          <w:rFonts w:ascii="Times New Roman" w:hAnsi="Times New Roman" w:cs="Times New Roman"/>
-          <w:sz w:val="26"/>
-          <w:szCs w:val="26"/>
-        </w:rPr>
-        <w:t>Màu sơn: [ĐS.Màu sơn]</w:t>
-      </w:r>
-      <w:r>
-        <w:rPr>
-          <w:rFonts w:ascii="Times New Roman" w:hAnsi="Times New Roman" w:cs="Times New Roman"/>
-          <w:sz w:val="26"/>
-          <w:szCs w:val="26"/>
-        </w:rPr>
-        <w:tab/>
-      </w:r>
-      <w:r>
-        <w:rPr>
-          <w:rFonts w:ascii="Times New Roman" w:hAnsi="Times New Roman" w:cs="Times New Roman"/>
-          <w:sz w:val="26"/>
-          <w:szCs w:val="26"/>
-        </w:rPr>
-        <w:tab/>
-      </w:r>
-      <w:r>
-        <w:rPr>
-          <w:rFonts w:ascii="Times New Roman" w:hAnsi="Times New Roman" w:cs="Times New Roman"/>
-          <w:sz w:val="26"/>
-          <w:szCs w:val="26"/>
-        </w:rPr>
-        <w:tab/>
-      </w:r>
-      <w:r>
-        <w:rPr>
-          <w:rFonts w:ascii="Times New Roman" w:hAnsi="Times New Roman" w:cs="Times New Roman"/>
-          <w:sz w:val="26"/>
-          <w:szCs w:val="26"/>
-        </w:rPr>
-        <w:tab/>
-      </w:r>
-      <w:r>
-        <w:rPr>
-          <w:rFonts w:ascii="Times New Roman" w:hAnsi="Times New Roman" w:cs="Times New Roman"/>
-          <w:sz w:val="26"/>
-          <w:szCs w:val="26"/>
-        </w:rPr>
-        <w:t>Số máy: [ĐS.Số máy]</w:t>
-      </w:r>
-    </w:p>
-    <w:p>
-      <w:pPr>
-        <w:spacing w:before="60" w:after="60" w:line="276" w:lineRule="auto"/>
-        <w:ind w:firstLine="567"/>
-        <w:jc w:val="both"/>
-        <w:rPr>
-          <w:rFonts w:ascii="Times New Roman" w:hAnsi="Times New Roman" w:cs="Times New Roman"/>
-          <w:sz w:val="26"/>
-          <w:szCs w:val="26"/>
-        </w:rPr>
-      </w:pPr>
-      <w:r>
-        <w:rPr>
-          <w:rFonts w:ascii="Times New Roman" w:hAnsi="Times New Roman" w:cs="Times New Roman"/>
-          <w:sz w:val="26"/>
-          <w:szCs w:val="26"/>
-        </w:rPr>
-        <w:t>Năm sản xuất: [ĐS.Năm sản xuất]</w:t>
-      </w:r>
-      <w:r>
-        <w:rPr>
-          <w:rFonts w:ascii="Times New Roman" w:hAnsi="Times New Roman" w:cs="Times New Roman"/>
-          <w:sz w:val="26"/>
-          <w:szCs w:val="26"/>
-        </w:rPr>
-        <w:tab/>
-      </w:r>
-      <w:r>
-        <w:rPr>
-          <w:rFonts w:ascii="Times New Roman" w:hAnsi="Times New Roman" w:cs="Times New Roman"/>
-          <w:sz w:val="26"/>
-          <w:szCs w:val="26"/>
-        </w:rPr>
-        <w:tab/>
-      </w:r>
-      <w:r>
-        <w:rPr>
-          <w:rFonts w:ascii="Times New Roman" w:hAnsi="Times New Roman" w:cs="Times New Roman"/>
-          <w:sz w:val="26"/>
-          <w:szCs w:val="26"/>
-        </w:rPr>
-        <w:tab/>
-      </w:r>
-      <w:r>
-        <w:rPr>
-          <w:rFonts w:ascii="Times New Roman" w:hAnsi="Times New Roman" w:cs="Times New Roman"/>
-          <w:sz w:val="26"/>
-          <w:szCs w:val="26"/>
-        </w:rPr>
-        <w:t>Số khung: [ĐS.Số khung]</w:t>
-      </w:r>
-    </w:p>
-    <w:p>
-      <w:pPr>
-        <w:spacing w:before="60" w:after="60" w:line="276" w:lineRule="auto"/>
-        <w:ind w:firstLine="567"/>
-        <w:jc w:val="both"/>
-        <w:rPr>
-          <w:rFonts w:ascii="Times New Roman" w:hAnsi="Times New Roman" w:cs="Times New Roman"/>
-          <w:sz w:val="26"/>
-          <w:szCs w:val="26"/>
-        </w:rPr>
-      </w:pPr>
-      <w:r>
-        <w:rPr>
-          <w:rFonts w:ascii="Times New Roman" w:hAnsi="Times New Roman" w:cs="Times New Roman"/>
-          <w:sz w:val="26"/>
-          <w:szCs w:val="26"/>
-        </w:rPr>
-        <w:t>Biển kiểm soát: [ĐS.Biển kiểm soát]</w:t>
-      </w:r>
-      <w:r>
-        <w:rPr>
-          <w:rFonts w:ascii="Times New Roman" w:hAnsi="Times New Roman" w:cs="Times New Roman"/>
-          <w:sz w:val="26"/>
-          <w:szCs w:val="26"/>
-        </w:rPr>
-        <w:tab/>
-      </w:r>
-      <w:r>
-        <w:rPr>
-          <w:rFonts w:ascii="Times New Roman" w:hAnsi="Times New Roman" w:cs="Times New Roman"/>
-          <w:sz w:val="26"/>
-          <w:szCs w:val="26"/>
-        </w:rPr>
-        <w:tab/>
-      </w:r>
-      <w:r>
-        <w:rPr>
-          <w:rFonts w:ascii="Times New Roman" w:hAnsi="Times New Roman" w:cs="Times New Roman"/>
-          <w:sz w:val="26"/>
-          <w:szCs w:val="26"/>
-        </w:rPr>
-        <w:t>Số chỗ ngồi: [ĐS.Số chỗ ngồi]</w:t>
-      </w:r>
-    </w:p>
-    <w:p>
-      <w:pPr>
-        <w:spacing w:before="60" w:after="60" w:line="276" w:lineRule="auto"/>
-        <w:ind w:firstLine="567"/>
-        <w:jc w:val="both"/>
-        <w:rPr>
-          <w:rFonts w:ascii="Times New Roman" w:hAnsi="Times New Roman" w:cs="Times New Roman"/>
-          <w:sz w:val="26"/>
-          <w:szCs w:val="26"/>
-        </w:rPr>
-      </w:pPr>
-      <w:r>
-        <w:rPr>
-          <w:rFonts w:ascii="Times New Roman" w:hAnsi="Times New Roman" w:cs="Times New Roman"/>
-          <w:sz w:val="26"/>
-          <w:szCs w:val="26"/>
-        </w:rPr>
-        <w:t>b) Xác định tình trạng tài sản: [ĐS.Tình trạng sử dụng TS]</w:t>
-      </w:r>
-    </w:p>
-    <w:p>
-      <w:pPr>
-        <w:spacing w:before="60" w:after="60" w:line="276" w:lineRule="auto"/>
-        <w:ind w:firstLine="567"/>
-        <w:jc w:val="both"/>
-        <w:rPr>
-          <w:rFonts w:ascii="Times New Roman" w:hAnsi="Times New Roman" w:cs="Times New Roman"/>
-          <w:sz w:val="26"/>
-          <w:szCs w:val="26"/>
-        </w:rPr>
-      </w:pPr>
-      <w:r>
-        <w:rPr>
-          <w:rFonts w:ascii="Times New Roman" w:hAnsi="Times New Roman" w:cs="Times New Roman"/>
-          <w:sz w:val="26"/>
-          <w:szCs w:val="26"/>
-        </w:rPr>
-        <w:t>c) Xác định tính tranh chấp của tài sản:</w:t>
-      </w:r>
-    </w:p>
-    <w:p>
-      <w:pPr>
-        <w:spacing w:before="60" w:after="60" w:line="276" w:lineRule="auto"/>
-        <w:ind w:firstLine="567"/>
-        <w:jc w:val="both"/>
-        <w:rPr>
-          <w:rFonts w:ascii="Times New Roman" w:hAnsi="Times New Roman" w:cs="Times New Roman"/>
-          <w:sz w:val="26"/>
-          <w:szCs w:val="26"/>
-        </w:rPr>
-      </w:pPr>
-      <w:r>
-        <w:rPr>
-          <w:rFonts w:ascii="Times New Roman" w:hAnsi="Times New Roman" w:cs="Times New Roman"/>
-          <w:sz w:val="26"/>
-          <w:szCs w:val="26"/>
-        </w:rPr>
-        <w:t>- Người sử dụng đồng thời là chủ sở hữu tài sản: [ĐS.Tên chủ sở hữu TS].</w:t>
-      </w:r>
-    </w:p>
-    <w:p>
-      <w:pPr>
-        <w:spacing w:before="60" w:after="60" w:line="276" w:lineRule="auto"/>
-        <w:ind w:firstLine="567"/>
-        <w:jc w:val="both"/>
-        <w:rPr>
-          <w:rFonts w:ascii="Times New Roman" w:hAnsi="Times New Roman" w:cs="Times New Roman"/>
-          <w:sz w:val="26"/>
-          <w:szCs w:val="26"/>
-        </w:rPr>
-      </w:pPr>
-      <w:r>
-        <w:rPr>
-          <w:rFonts w:ascii="Times New Roman" w:hAnsi="Times New Roman" w:cs="Times New Roman"/>
-          <w:sz w:val="26"/>
-          <w:szCs w:val="26"/>
-        </w:rPr>
-        <w:t>- Tại thời điểm thẩm định, tài sản không có tranh chấp, toàn bộ thuộc tài sản thế chấp.</w:t>
-      </w:r>
-    </w:p>
-    <w:p>
-      <w:pPr>
-        <w:spacing w:before="60" w:after="60" w:line="276" w:lineRule="auto"/>
-        <w:ind w:firstLine="567"/>
-        <w:jc w:val="both"/>
-        <w:rPr>
-          <w:rFonts w:ascii="Times New Roman" w:hAnsi="Times New Roman" w:cs="Times New Roman"/>
-          <w:sz w:val="26"/>
-          <w:szCs w:val="26"/>
-        </w:rPr>
-      </w:pPr>
-      <w:r>
-        <w:rPr>
-          <w:rFonts w:ascii="Times New Roman" w:hAnsi="Times New Roman" w:cs="Times New Roman"/>
-          <w:sz w:val="26"/>
-          <w:szCs w:val="26"/>
-        </w:rPr>
-        <w:t>d) Tính thanh khoản: [ĐS.Khái quát về lợi thế]</w:t>
-      </w:r>
-    </w:p>
-    <w:p>
-      <w:pPr>
-        <w:spacing w:before="60" w:after="60" w:line="276" w:lineRule="auto"/>
-        <w:ind w:firstLine="567"/>
-        <w:jc w:val="both"/>
-        <w:rPr>
-          <w:rFonts w:ascii="Times New Roman" w:hAnsi="Times New Roman" w:cs="Times New Roman"/>
-          <w:sz w:val="26"/>
-          <w:szCs w:val="26"/>
-        </w:rPr>
-      </w:pPr>
-      <w:r>
-        <w:rPr>
-          <w:rFonts w:ascii="Times New Roman" w:hAnsi="Times New Roman" w:cs="Times New Roman"/>
-          <w:sz w:val="26"/>
-          <w:szCs w:val="26"/>
-        </w:rPr>
-        <w:t>e) Mua bảo hiểm TSBĐ: [ĐS.Mua bảo hiểm TSBĐ]</w:t>
-      </w:r>
-    </w:p>
-    <w:p>
-      <w:pPr>
-        <w:spacing w:before="60" w:after="60" w:line="276" w:lineRule="auto"/>
-        <w:ind w:firstLine="567"/>
-        <w:jc w:val="both"/>
-        <w:rPr>
-          <w:rFonts w:ascii="Times New Roman" w:hAnsi="Times New Roman" w:cs="Times New Roman"/>
-          <w:sz w:val="26"/>
-          <w:szCs w:val="26"/>
-        </w:rPr>
-      </w:pPr>
-      <w:r>
-        <w:rPr>
-          <w:rFonts w:ascii="Times New Roman" w:hAnsi="Times New Roman" w:cs="Times New Roman"/>
-          <w:sz w:val="26"/>
-          <w:szCs w:val="26"/>
-        </w:rPr>
-        <w:t>f) Thời hạn sử dụng còn lại: [ĐS.Thời hạn sử dụng]</w:t>
-      </w:r>
-    </w:p>
-    <w:p>
-      <w:pPr>
-        <w:spacing w:before="60" w:after="60" w:line="276" w:lineRule="auto"/>
-        <w:ind w:firstLine="567"/>
-        <w:jc w:val="both"/>
-        <w:rPr>
-          <w:rFonts w:ascii="Times New Roman" w:hAnsi="Times New Roman" w:cs="Times New Roman"/>
-          <w:sz w:val="26"/>
-          <w:szCs w:val="26"/>
-        </w:rPr>
-      </w:pPr>
-      <w:r>
-        <w:rPr>
-          <w:rFonts w:ascii="Times New Roman" w:hAnsi="Times New Roman" w:cs="Times New Roman"/>
-          <w:sz w:val="26"/>
-          <w:szCs w:val="26"/>
-        </w:rPr>
-        <w:t>[/ĐS]</w:t>
-      </w:r>
-    </w:p>
-    <w:p>
-      <w:pPr>
-        <w:widowControl w:val="0"/>
-        <w:spacing w:after="0" w:line="276" w:lineRule="auto"/>
-        <w:ind w:firstLine="567"/>
-        <w:contextualSpacing/>
-        <w:jc w:val="both"/>
-        <w:rPr>
-          <w:rFonts w:ascii="Times New Roman" w:eastAsia="Calibri" w:hAnsi="Times New Roman" w:cs="Times New Roman"/>
           <w:b/>
           <w:bCs/>
           <w:sz w:val="26"/>
           <w:szCs w:val="26"/>
-          <w:lang w:val="fr-FR"/>
-        </w:rPr>
-      </w:pPr>
-      <w:r>
-        <w:rPr>
-          <w:rFonts w:ascii="Times New Roman" w:eastAsia="Calibri" w:hAnsi="Times New Roman" w:cs="Times New Roman"/>
+        </w:rPr>
+        <w:t>4.[STT].</w:t>
+      </w:r>
+      <w:r>
+        <w:rPr>
+          <w:rFonts w:ascii="Times New Roman" w:hAnsi="Times New Roman" w:cs="Times New Roman"/>
+          <w:sz w:val="26"/>
+          <w:szCs w:val="26"/>
+        </w:rPr>
+        <w:t xml:space="preserve"> </w:t>
+      </w:r>
+      <w:r>
+        <w:rPr>
+          <w:rFonts w:ascii="Times New Roman" w:eastAsia="Times New Roman" w:hAnsi="Times New Roman" w:cs="Times New Roman"/>
           <w:b/>
           <w:bCs/>
           <w:sz w:val="26"/>
           <w:szCs w:val="26"/>
+        </w:rPr>
+        <w:t>Chi tiết tài sản</w:t>
+      </w:r>
+      <w:r>
+        <w:rPr>
+          <w:rFonts w:ascii="Times New Roman" w:eastAsia="Times New Roman" w:hAnsi="Times New Roman" w:cs="Times New Roman"/>
+          <w:b/>
+          <w:bCs/>
+          <w:sz w:val="26"/>
+          <w:szCs w:val="26"/>
+        </w:rPr>
+        <w:t xml:space="preserve"> thứ [STT]</w:t>
+      </w:r>
+    </w:p>
+    <w:p>
+      <w:pPr>
+        <w:spacing w:before="60" w:after="60" w:line="276" w:lineRule="auto"/>
+        <w:ind w:firstLine="567"/>
+        <w:jc w:val="both"/>
+        <w:rPr>
+          <w:rFonts w:ascii="Times New Roman" w:hAnsi="Times New Roman" w:cs="Times New Roman"/>
+          <w:sz w:val="26"/>
+          <w:szCs w:val="26"/>
+        </w:rPr>
+      </w:pPr>
+      <w:r>
+        <w:rPr>
+          <w:rFonts w:ascii="Times New Roman" w:hAnsi="Times New Roman" w:cs="Times New Roman"/>
+          <w:sz w:val="26"/>
+          <w:szCs w:val="26"/>
+        </w:rPr>
+        <w:t>a) Chi tiết tài sản (theo Giấy chứng nhận đăng ký xe ô tô số [ĐS.Giấy đăng ký số] do [ĐS.Cơ quan cấp] cấp ngày [ĐS.Cấp ngày])</w:t>
+      </w:r>
+    </w:p>
+    <w:p>
+      <w:pPr>
+        <w:spacing w:before="60" w:after="60" w:line="276" w:lineRule="auto"/>
+        <w:ind w:firstLine="567"/>
+        <w:jc w:val="both"/>
+        <w:rPr>
+          <w:rFonts w:ascii="Times New Roman" w:hAnsi="Times New Roman" w:cs="Times New Roman"/>
+          <w:sz w:val="26"/>
+          <w:szCs w:val="26"/>
+        </w:rPr>
+      </w:pPr>
+      <w:r>
+        <w:rPr>
+          <w:rFonts w:ascii="Times New Roman" w:hAnsi="Times New Roman" w:cs="Times New Roman"/>
+          <w:sz w:val="26"/>
+          <w:szCs w:val="26"/>
+        </w:rPr>
+        <w:t>Nhãn hiệu: [ĐS.Nhãn hiệu]</w:t>
+      </w:r>
+      <w:r>
+        <w:rPr>
+          <w:rFonts w:ascii="Times New Roman" w:hAnsi="Times New Roman" w:cs="Times New Roman"/>
+          <w:sz w:val="26"/>
+          <w:szCs w:val="26"/>
+        </w:rPr>
+        <w:tab/>
+      </w:r>
+      <w:r>
+        <w:rPr>
+          <w:rFonts w:ascii="Times New Roman" w:hAnsi="Times New Roman" w:cs="Times New Roman"/>
+          <w:sz w:val="26"/>
+          <w:szCs w:val="26"/>
+        </w:rPr>
+        <w:tab/>
+      </w:r>
+      <w:r>
+        <w:rPr>
+          <w:rFonts w:ascii="Times New Roman" w:hAnsi="Times New Roman" w:cs="Times New Roman"/>
+          <w:sz w:val="26"/>
+          <w:szCs w:val="26"/>
+        </w:rPr>
+        <w:tab/>
+      </w:r>
+      <w:r>
+        <w:rPr>
+          <w:rFonts w:ascii="Times New Roman" w:hAnsi="Times New Roman" w:cs="Times New Roman"/>
+          <w:sz w:val="26"/>
+          <w:szCs w:val="26"/>
+        </w:rPr>
+        <w:tab/>
+      </w:r>
+      <w:r>
+        <w:rPr>
+          <w:rFonts w:ascii="Times New Roman" w:hAnsi="Times New Roman" w:cs="Times New Roman"/>
+          <w:sz w:val="26"/>
+          <w:szCs w:val="26"/>
+        </w:rPr>
+        <w:t>Số loại: [ĐS.Số loại]</w:t>
+      </w:r>
+    </w:p>
+    <w:p>
+      <w:pPr>
+        <w:spacing w:before="60" w:after="60" w:line="276" w:lineRule="auto"/>
+        <w:ind w:firstLine="567"/>
+        <w:jc w:val="both"/>
+        <w:rPr>
+          <w:rFonts w:ascii="Times New Roman" w:hAnsi="Times New Roman" w:cs="Times New Roman"/>
+          <w:sz w:val="26"/>
+          <w:szCs w:val="26"/>
+        </w:rPr>
+      </w:pPr>
+      <w:r>
+        <w:rPr>
+          <w:rFonts w:ascii="Times New Roman" w:hAnsi="Times New Roman" w:cs="Times New Roman"/>
+          <w:sz w:val="26"/>
+          <w:szCs w:val="26"/>
+        </w:rPr>
+        <w:t>Màu sơn: [ĐS.Màu sơn]</w:t>
+      </w:r>
+      <w:r>
+        <w:rPr>
+          <w:rFonts w:ascii="Times New Roman" w:hAnsi="Times New Roman" w:cs="Times New Roman"/>
+          <w:sz w:val="26"/>
+          <w:szCs w:val="26"/>
+        </w:rPr>
+        <w:tab/>
+      </w:r>
+      <w:r>
+        <w:rPr>
+          <w:rFonts w:ascii="Times New Roman" w:hAnsi="Times New Roman" w:cs="Times New Roman"/>
+          <w:sz w:val="26"/>
+          <w:szCs w:val="26"/>
+        </w:rPr>
+        <w:tab/>
+      </w:r>
+      <w:r>
+        <w:rPr>
+          <w:rFonts w:ascii="Times New Roman" w:hAnsi="Times New Roman" w:cs="Times New Roman"/>
+          <w:sz w:val="26"/>
+          <w:szCs w:val="26"/>
+        </w:rPr>
+        <w:tab/>
+      </w:r>
+      <w:r>
+        <w:rPr>
+          <w:rFonts w:ascii="Times New Roman" w:hAnsi="Times New Roman" w:cs="Times New Roman"/>
+          <w:sz w:val="26"/>
+          <w:szCs w:val="26"/>
+        </w:rPr>
+        <w:tab/>
+      </w:r>
+      <w:r>
+        <w:rPr>
+          <w:rFonts w:ascii="Times New Roman" w:hAnsi="Times New Roman" w:cs="Times New Roman"/>
+          <w:sz w:val="26"/>
+          <w:szCs w:val="26"/>
+        </w:rPr>
+        <w:t>Số máy: [ĐS.Số máy]</w:t>
+      </w:r>
+    </w:p>
+    <w:p>
+      <w:pPr>
+        <w:spacing w:before="60" w:after="60" w:line="276" w:lineRule="auto"/>
+        <w:ind w:firstLine="567"/>
+        <w:jc w:val="both"/>
+        <w:rPr>
+          <w:rFonts w:ascii="Times New Roman" w:hAnsi="Times New Roman" w:cs="Times New Roman"/>
+          <w:sz w:val="26"/>
+          <w:szCs w:val="26"/>
+        </w:rPr>
+      </w:pPr>
+      <w:r>
+        <w:rPr>
+          <w:rFonts w:ascii="Times New Roman" w:hAnsi="Times New Roman" w:cs="Times New Roman"/>
+          <w:sz w:val="26"/>
+          <w:szCs w:val="26"/>
+        </w:rPr>
+        <w:t>Năm sản xuất: [ĐS.Năm sản xuất]</w:t>
+      </w:r>
+      <w:r>
+        <w:rPr>
+          <w:rFonts w:ascii="Times New Roman" w:hAnsi="Times New Roman" w:cs="Times New Roman"/>
+          <w:sz w:val="26"/>
+          <w:szCs w:val="26"/>
+        </w:rPr>
+        <w:tab/>
+      </w:r>
+      <w:r>
+        <w:rPr>
+          <w:rFonts w:ascii="Times New Roman" w:hAnsi="Times New Roman" w:cs="Times New Roman"/>
+          <w:sz w:val="26"/>
+          <w:szCs w:val="26"/>
+        </w:rPr>
+        <w:tab/>
+      </w:r>
+      <w:r>
+        <w:rPr>
+          <w:rFonts w:ascii="Times New Roman" w:hAnsi="Times New Roman" w:cs="Times New Roman"/>
+          <w:sz w:val="26"/>
+          <w:szCs w:val="26"/>
+        </w:rPr>
+        <w:tab/>
+      </w:r>
+      <w:r>
+        <w:rPr>
+          <w:rFonts w:ascii="Times New Roman" w:hAnsi="Times New Roman" w:cs="Times New Roman"/>
+          <w:sz w:val="26"/>
+          <w:szCs w:val="26"/>
+        </w:rPr>
+        <w:t>Số khung: [ĐS.Số khung]</w:t>
+      </w:r>
+    </w:p>
+    <w:p>
+      <w:pPr>
+        <w:spacing w:before="60" w:after="60" w:line="276" w:lineRule="auto"/>
+        <w:ind w:firstLine="567"/>
+        <w:jc w:val="both"/>
+        <w:rPr>
+          <w:rFonts w:ascii="Times New Roman" w:hAnsi="Times New Roman" w:cs="Times New Roman"/>
+          <w:sz w:val="26"/>
+          <w:szCs w:val="26"/>
+        </w:rPr>
+      </w:pPr>
+      <w:r>
+        <w:rPr>
+          <w:rFonts w:ascii="Times New Roman" w:hAnsi="Times New Roman" w:cs="Times New Roman"/>
+          <w:sz w:val="26"/>
+          <w:szCs w:val="26"/>
+        </w:rPr>
+        <w:t>Biển kiểm soát: [ĐS.Biển kiểm soát]</w:t>
+      </w:r>
+      <w:r>
+        <w:rPr>
+          <w:rFonts w:ascii="Times New Roman" w:hAnsi="Times New Roman" w:cs="Times New Roman"/>
+          <w:sz w:val="26"/>
+          <w:szCs w:val="26"/>
+        </w:rPr>
+        <w:tab/>
+      </w:r>
+      <w:r>
+        <w:rPr>
+          <w:rFonts w:ascii="Times New Roman" w:hAnsi="Times New Roman" w:cs="Times New Roman"/>
+          <w:sz w:val="26"/>
+          <w:szCs w:val="26"/>
+        </w:rPr>
+        <w:tab/>
+      </w:r>
+      <w:r>
+        <w:rPr>
+          <w:rFonts w:ascii="Times New Roman" w:hAnsi="Times New Roman" w:cs="Times New Roman"/>
+          <w:sz w:val="26"/>
+          <w:szCs w:val="26"/>
+        </w:rPr>
+        <w:t>Số chỗ ngồi: [ĐS.Số chỗ ngồi]</w:t>
+      </w:r>
+    </w:p>
+    <w:p>
+      <w:pPr>
+        <w:spacing w:before="60" w:after="60" w:line="276" w:lineRule="auto"/>
+        <w:ind w:firstLine="567"/>
+        <w:jc w:val="both"/>
+        <w:rPr>
+          <w:rFonts w:ascii="Times New Roman" w:hAnsi="Times New Roman" w:cs="Times New Roman"/>
+          <w:sz w:val="26"/>
+          <w:szCs w:val="26"/>
+        </w:rPr>
+      </w:pPr>
+      <w:r>
+        <w:rPr>
+          <w:rFonts w:ascii="Times New Roman" w:hAnsi="Times New Roman" w:cs="Times New Roman"/>
+          <w:sz w:val="26"/>
+          <w:szCs w:val="26"/>
+        </w:rPr>
+        <w:t>b) Xác định tình trạng tài sản: [ĐS.Tình trạng sử dụng TS]</w:t>
+      </w:r>
+    </w:p>
+    <w:p>
+      <w:pPr>
+        <w:spacing w:before="60" w:after="60" w:line="276" w:lineRule="auto"/>
+        <w:ind w:firstLine="567"/>
+        <w:jc w:val="both"/>
+        <w:rPr>
+          <w:rFonts w:ascii="Times New Roman" w:hAnsi="Times New Roman" w:cs="Times New Roman"/>
+          <w:sz w:val="26"/>
+          <w:szCs w:val="26"/>
+        </w:rPr>
+      </w:pPr>
+      <w:r>
+        <w:rPr>
+          <w:rFonts w:ascii="Times New Roman" w:hAnsi="Times New Roman" w:cs="Times New Roman"/>
+          <w:sz w:val="26"/>
+          <w:szCs w:val="26"/>
+        </w:rPr>
+        <w:t>c) Xác định tính tranh chấp của tài sản:</w:t>
+      </w:r>
+    </w:p>
+    <w:p>
+      <w:pPr>
+        <w:spacing w:before="60" w:after="60" w:line="276" w:lineRule="auto"/>
+        <w:ind w:firstLine="567"/>
+        <w:jc w:val="both"/>
+        <w:rPr>
+          <w:rFonts w:ascii="Times New Roman" w:hAnsi="Times New Roman" w:cs="Times New Roman"/>
+          <w:sz w:val="26"/>
+          <w:szCs w:val="26"/>
+        </w:rPr>
+      </w:pPr>
+      <w:r>
+        <w:rPr>
+          <w:rFonts w:ascii="Times New Roman" w:hAnsi="Times New Roman" w:cs="Times New Roman"/>
+          <w:sz w:val="26"/>
+          <w:szCs w:val="26"/>
+        </w:rPr>
+        <w:t>- Người sử dụng đồng thời là chủ sở hữu tài sản: [ĐS.Tên chủ sở hữu TS].</w:t>
+      </w:r>
+    </w:p>
+    <w:p>
+      <w:pPr>
+        <w:spacing w:before="60" w:after="60" w:line="276" w:lineRule="auto"/>
+        <w:ind w:firstLine="567"/>
+        <w:jc w:val="both"/>
+        <w:rPr>
+          <w:rFonts w:ascii="Times New Roman" w:hAnsi="Times New Roman" w:cs="Times New Roman"/>
+          <w:sz w:val="26"/>
+          <w:szCs w:val="26"/>
+        </w:rPr>
+      </w:pPr>
+      <w:r>
+        <w:rPr>
+          <w:rFonts w:ascii="Times New Roman" w:hAnsi="Times New Roman" w:cs="Times New Roman"/>
+          <w:sz w:val="26"/>
+          <w:szCs w:val="26"/>
+        </w:rPr>
+        <w:t>- Tại thời điểm thẩm định, tài sản không có tranh chấp, toàn bộ thuộc tài sản thế chấp.</w:t>
+      </w:r>
+    </w:p>
+    <w:p>
+      <w:pPr>
+        <w:spacing w:before="60" w:after="60" w:line="276" w:lineRule="auto"/>
+        <w:ind w:firstLine="567"/>
+        <w:jc w:val="both"/>
+        <w:rPr>
+          <w:rFonts w:ascii="Times New Roman" w:hAnsi="Times New Roman" w:cs="Times New Roman"/>
+          <w:sz w:val="26"/>
+          <w:szCs w:val="26"/>
+        </w:rPr>
+      </w:pPr>
+      <w:r>
+        <w:rPr>
+          <w:rFonts w:ascii="Times New Roman" w:hAnsi="Times New Roman" w:cs="Times New Roman"/>
+          <w:sz w:val="26"/>
+          <w:szCs w:val="26"/>
+        </w:rPr>
+        <w:t>d) Tính thanh khoản: [ĐS.Khái quát về lợi thế]</w:t>
+      </w:r>
+    </w:p>
+    <w:p>
+      <w:pPr>
+        <w:spacing w:before="60" w:after="60" w:line="276" w:lineRule="auto"/>
+        <w:ind w:firstLine="567"/>
+        <w:jc w:val="both"/>
+        <w:rPr>
+          <w:rFonts w:ascii="Times New Roman" w:hAnsi="Times New Roman" w:cs="Times New Roman"/>
+          <w:sz w:val="26"/>
+          <w:szCs w:val="26"/>
+        </w:rPr>
+      </w:pPr>
+      <w:r>
+        <w:rPr>
+          <w:rFonts w:ascii="Times New Roman" w:hAnsi="Times New Roman" w:cs="Times New Roman"/>
+          <w:sz w:val="26"/>
+          <w:szCs w:val="26"/>
+        </w:rPr>
+        <w:t>e) Mua bảo hiểm TSBĐ: [ĐS.Mua bảo hiểm TSBĐ]</w:t>
+      </w:r>
+    </w:p>
+    <w:p>
+      <w:pPr>
+        <w:spacing w:before="60" w:after="60" w:line="276" w:lineRule="auto"/>
+        <w:ind w:firstLine="567"/>
+        <w:jc w:val="both"/>
+        <w:rPr>
+          <w:rFonts w:ascii="Times New Roman" w:hAnsi="Times New Roman" w:cs="Times New Roman"/>
+          <w:sz w:val="26"/>
+          <w:szCs w:val="26"/>
+        </w:rPr>
+      </w:pPr>
+      <w:r>
+        <w:rPr>
+          <w:rFonts w:ascii="Times New Roman" w:hAnsi="Times New Roman" w:cs="Times New Roman"/>
+          <w:sz w:val="26"/>
+          <w:szCs w:val="26"/>
+        </w:rPr>
+        <w:t>f) Thời hạn sử dụng còn lại: [ĐS.Thời hạn sử dụng]</w:t>
+      </w:r>
+    </w:p>
+    <w:p>
+      <w:pPr>
+        <w:spacing w:before="60" w:after="60" w:line="276" w:lineRule="auto"/>
+        <w:ind w:firstLine="567"/>
+        <w:jc w:val="both"/>
+        <w:rPr>
+          <w:rFonts w:ascii="Times New Roman" w:hAnsi="Times New Roman" w:cs="Times New Roman"/>
+          <w:sz w:val="26"/>
+          <w:szCs w:val="26"/>
+        </w:rPr>
+      </w:pPr>
+      <w:r>
+        <w:rPr>
+          <w:rFonts w:ascii="Times New Roman" w:hAnsi="Times New Roman" w:cs="Times New Roman"/>
+          <w:sz w:val="26"/>
+          <w:szCs w:val="26"/>
+        </w:rPr>
+        <w:lastRenderedPageBreak/>
+        <w:t>[/ĐS]</w:t>
+      </w:r>
+    </w:p>
+    <w:p>
+      <w:pPr>
+        <w:widowControl w:val="0"/>
+        <w:spacing w:after="0" w:line="276" w:lineRule="auto"/>
+        <w:ind w:firstLine="567"/>
+        <w:contextualSpacing/>
+        <w:jc w:val="both"/>
+        <w:rPr>
+          <w:rFonts w:ascii="Times New Roman" w:eastAsia="Calibri" w:hAnsi="Times New Roman" w:cs="Times New Roman"/>
+          <w:b/>
+          <w:bCs/>
+          <w:sz w:val="26"/>
+          <w:szCs w:val="26"/>
           <w:lang w:val="fr-FR"/>
         </w:rPr>
-        <w:lastRenderedPageBreak/>
-        <w:t>4.2</w:t>
+      </w:pPr>
+      <w:r>
+        <w:rPr>
+          <w:rFonts w:ascii="Times New Roman" w:eastAsia="Calibri" w:hAnsi="Times New Roman" w:cs="Times New Roman"/>
+          <w:b/>
+          <w:bCs/>
+          <w:sz w:val="26"/>
+          <w:szCs w:val="26"/>
+          <w:lang w:val="fr-FR"/>
+        </w:rPr>
+        <w:t>4.</w:t>
+      </w:r>
+      <w:r>
+        <w:rPr>
+          <w:rFonts w:ascii="Times New Roman" w:eastAsia="Calibri" w:hAnsi="Times New Roman" w:cs="Times New Roman"/>
+          <w:b/>
+          <w:bCs/>
+          <w:sz w:val="26"/>
+          <w:szCs w:val="26"/>
+          <w:lang w:val="fr-FR"/>
+        </w:rPr>
+        <w:t>3</w:t>
       </w:r>
       <w:r>
         <w:rPr>
@@ -7367,7 +7428,7 @@
           <w:szCs w:val="26"/>
           <w:lang w:val="fr-FR"/>
         </w:rPr>
-        <w:t>4.3</w:t>
+        <w:t>4.</w:t>
       </w:r>
       <w:r>
         <w:rPr>
@@ -7378,7 +7439,7 @@
           <w:szCs w:val="26"/>
           <w:lang w:val="fr-FR"/>
         </w:rPr>
-        <w:t>. Mức cho vay có bảo đảm bằng tài sả</w:t>
+        <w:t>4</w:t>
       </w:r>
       <w:r>
         <w:rPr>
@@ -7389,6 +7450,17 @@
           <w:szCs w:val="26"/>
           <w:lang w:val="fr-FR"/>
         </w:rPr>
+        <w:t>. Mức cho vay có bảo đảm bằng tài sả</w:t>
+      </w:r>
+      <w:r>
+        <w:rPr>
+          <w:rFonts w:ascii="Times New Roman" w:eastAsia="Calibri" w:hAnsi="Times New Roman" w:cs="Times New Roman"/>
+          <w:b/>
+          <w:bCs/>
+          <w:sz w:val="26"/>
+          <w:szCs w:val="26"/>
+          <w:lang w:val="fr-FR"/>
+        </w:rPr>
         <w:t xml:space="preserve">n: </w:t>
       </w:r>
       <w:r>
@@ -7436,7 +7508,18 @@
           <w:szCs w:val="26"/>
           <w:lang w:val="fr-FR"/>
         </w:rPr>
-        <w:t>4.4</w:t>
+        <w:t>4.</w:t>
+      </w:r>
+      <w:r>
+        <w:rPr>
+          <w:rFonts w:ascii="Times New Roman" w:eastAsia="Calibri" w:hAnsi="Times New Roman" w:cs="Times New Roman"/>
+          <w:b/>
+          <w:bCs/>
+          <w:sz w:val="26"/>
+          <w:szCs w:val="26"/>
+          <w:lang w:val="fr-FR"/>
+        </w:rPr>
+        <w:t>5</w:t>
       </w:r>
       <w:r>
         <w:rPr>
@@ -8289,7 +8372,6 @@
           <w:sz w:val="26"/>
           <w:szCs w:val="27"/>
         </w:rPr>
-        <w:lastRenderedPageBreak/>
         <w:t>B. PHẦN THẨM ĐỊNH VÀ ĐỀ XUẤT CHO VAY CỦA NGƯỜI THẨM ĐỊNH</w:t>
       </w:r>
     </w:p>
@@ -9663,7 +9745,7 @@
           <w:sz w:val="26"/>
           <w:szCs w:val="26"/>
         </w:rPr>
-        <w:t xml:space="preserve">- Trả gốc: Khách hàng cam kết sử dụng nguồn thu nhập từ lương và phụ cấp của [PA.Mô tả người trả nợ] để trả nợ gốc cho khoản vay tại Agribank Lâm Đồng PGD Hòa Bình trong vòng [PA.Thời hạn vay text], trả gốc [PA.Kỳ hạn trả gốc text], mỗi kỳ trả </w:t>
+        <w:t xml:space="preserve">- Trả gốc: Khách hàng cam kết sử dụng nguồn thu nhập từ lương và phụ cấp của [PA.Mô tả người trả nợ] để trả nợ gốc cho khoản vay tại Agribank Lâm Đồng PGD Hòa </w:t>
       </w:r>
       <w:r>
         <w:rPr>
@@ -9672,7 +9754,7 @@
           <w:szCs w:val="26"/>
         </w:rPr>
         <w:lastRenderedPageBreak/>
-        <w:t>[PA.Số tiền trả gốc mỗi kỳ] đồng. Thu nhập còn lại khách hàng sử dụng để trang trải các chi phí phát sinh khác.</w:t>
+        <w:t>Bình trong vòng [PA.Thời hạn vay text], trả gốc [PA.Kỳ hạn trả gốc text], mỗi kỳ trả [PA.Số tiền trả gốc mỗi kỳ] đồng. Thu nhập còn lại khách hàng sử dụng để trang trải các chi phí phát sinh khác.</w:t>
       </w:r>
     </w:p>
     <w:p>
@@ -11045,6 +11127,7 @@
           <w:szCs w:val="28"/>
           <w:lang w:val="pt-BR"/>
         </w:rPr>
+        <w:lastRenderedPageBreak/>
         <w:t>- Mục đích vay: [HĐTD.Mục đích vay]</w:t>
       </w:r>
       <w:r>
@@ -11080,7 +11163,6 @@
           <w:szCs w:val="28"/>
           <w:lang w:val="pt-BR"/>
         </w:rPr>
-        <w:lastRenderedPageBreak/>
         <w:t>- Phương thức cho vay: Từng lần</w:t>
       </w:r>
       <w:r>

</xml_diff>